<commit_message>
Setup secure database connection using environment variables
</commit_message>
<xml_diff>
--- a/Step guide.docx
+++ b/Step guide.docx
@@ -10195,39 +10195,2176 @@
         <w:t xml:space="preserve"> </w:t>
       </w:r>
       <w:r>
-        <w:t>Data cleaning</w:t>
-      </w:r>
+        <w:t>Data cleaning is NOT:</w:t>
+      </w:r>
+      <w:r>
+        <w:t xml:space="preserve"> </w:t>
+      </w:r>
+      <w:r>
+        <w:t>“fill everything”</w:t>
+      </w:r>
+    </w:p>
+    <w:p>
+      <w:pPr>
+        <w:pStyle w:val="IntenseQuote"/>
+      </w:pPr>
+      <w:r>
+        <w:rPr>
+          <w:rFonts w:ascii="Segoe UI Symbol" w:hAnsi="Segoe UI Symbol" w:cs="Segoe UI Symbol"/>
+        </w:rPr>
+        <w:t>👉</w:t>
+      </w:r>
+      <w:r>
+        <w:t xml:space="preserve"> It IS</w:t>
+      </w:r>
+      <w:r>
+        <w:t xml:space="preserve">: </w:t>
+      </w:r>
+      <w:r>
+        <w:t>“understand what each column represents, then decide”</w:t>
+      </w:r>
+    </w:p>
+    <w:p/>
+    <w:p/>
+    <w:p/>
+    <w:p/>
+    <w:p/>
+    <w:p/>
+    <w:p/>
+    <w:p/>
+    <w:p>
+      <w:pPr>
+        <w:tabs>
+          <w:tab w:val="left" w:pos="3044"/>
+        </w:tabs>
+      </w:pPr>
+      <w:r>
+        <w:tab/>
+      </w:r>
+    </w:p>
+    <w:p>
+      <w:pPr>
+        <w:spacing w:line="259" w:lineRule="auto"/>
+      </w:pPr>
+      <w:r>
+        <w:br w:type="page"/>
+      </w:r>
+    </w:p>
+    <w:p>
+      <w:pPr>
+        <w:tabs>
+          <w:tab w:val="left" w:pos="3044"/>
+        </w:tabs>
+      </w:pPr>
+      <w:r>
+        <w:rPr>
+          <w:noProof/>
+        </w:rPr>
+        <w:lastRenderedPageBreak/>
+        <mc:AlternateContent>
+          <mc:Choice Requires="wps">
+            <w:drawing>
+              <wp:anchor distT="0" distB="0" distL="114300" distR="114300" simplePos="0" relativeHeight="251663360" behindDoc="0" locked="0" layoutInCell="1" allowOverlap="1" wp14:anchorId="3059F2F1" wp14:editId="05C9E67D">
+                <wp:simplePos x="0" y="0"/>
+                <wp:positionH relativeFrom="column">
+                  <wp:posOffset>0</wp:posOffset>
+                </wp:positionH>
+                <wp:positionV relativeFrom="paragraph">
+                  <wp:posOffset>0</wp:posOffset>
+                </wp:positionV>
+                <wp:extent cx="1828800" cy="1828800"/>
+                <wp:effectExtent l="0" t="0" r="0" b="0"/>
+                <wp:wrapNone/>
+                <wp:docPr id="3" name="Text Box 3"/>
+                <wp:cNvGraphicFramePr/>
+                <a:graphic xmlns:a="http://schemas.openxmlformats.org/drawingml/2006/main">
+                  <a:graphicData uri="http://schemas.microsoft.com/office/word/2010/wordprocessingShape">
+                    <wps:wsp>
+                      <wps:cNvSpPr txBox="1"/>
+                      <wps:spPr>
+                        <a:xfrm>
+                          <a:off x="0" y="0"/>
+                          <a:ext cx="1828800" cy="1828800"/>
+                        </a:xfrm>
+                        <a:prstGeom prst="rect">
+                          <a:avLst/>
+                        </a:prstGeom>
+                        <a:noFill/>
+                        <a:ln>
+                          <a:noFill/>
+                        </a:ln>
+                      </wps:spPr>
+                      <wps:txbx>
+                        <w:txbxContent>
+                          <w:p>
+                            <w:pPr>
+                              <w:tabs>
+                                <w:tab w:val="left" w:pos="3044"/>
+                              </w:tabs>
+                              <w:jc w:val="center"/>
+                              <w:rPr>
+                                <w:sz w:val="72"/>
+                                <w:szCs w:val="72"/>
+                                <w:lang w:val="en-US"/>
+                                <w14:textOutline w14:w="0" w14:cap="flat" w14:cmpd="sng" w14:algn="ctr">
+                                  <w14:noFill/>
+                                  <w14:prstDash w14:val="solid"/>
+                                  <w14:round/>
+                                </w14:textOutline>
+                                <w14:textFill>
+                                  <w14:gradFill>
+                                    <w14:gsLst>
+                                      <w14:gs w14:pos="21000">
+                                        <w14:srgbClr w14:val="53575C"/>
+                                      </w14:gs>
+                                      <w14:gs w14:pos="88000">
+                                        <w14:srgbClr w14:val="C5C7CA"/>
+                                      </w14:gs>
+                                    </w14:gsLst>
+                                    <w14:lin w14:ang="5400000" w14:scaled="0"/>
+                                  </w14:gradFill>
+                                </w14:textFill>
+                              </w:rPr>
+                            </w:pPr>
+                            <w:r>
+                              <w:rPr>
+                                <w:sz w:val="72"/>
+                                <w:szCs w:val="72"/>
+                                <w:lang w:val="en-US"/>
+                                <w14:textOutline w14:w="0" w14:cap="flat" w14:cmpd="sng" w14:algn="ctr">
+                                  <w14:noFill/>
+                                  <w14:prstDash w14:val="solid"/>
+                                  <w14:round/>
+                                </w14:textOutline>
+                                <w14:textFill>
+                                  <w14:gradFill>
+                                    <w14:gsLst>
+                                      <w14:gs w14:pos="21000">
+                                        <w14:srgbClr w14:val="53575C"/>
+                                      </w14:gs>
+                                      <w14:gs w14:pos="88000">
+                                        <w14:srgbClr w14:val="C5C7CA"/>
+                                      </w14:gs>
+                                    </w14:gsLst>
+                                    <w14:lin w14:ang="5400000" w14:scaled="0"/>
+                                  </w14:gradFill>
+                                </w14:textFill>
+                              </w:rPr>
+                              <w:t>FEATURE ENGINEERING</w:t>
+                            </w:r>
+                          </w:p>
+                        </w:txbxContent>
+                      </wps:txbx>
+                      <wps:bodyPr rot="0" spcFirstLastPara="0" vertOverflow="overflow" horzOverflow="overflow" vert="horz" wrap="none" lIns="91440" tIns="45720" rIns="91440" bIns="45720" numCol="1" spcCol="0" rtlCol="0" fromWordArt="0" anchor="t" anchorCtr="0" forceAA="0" compatLnSpc="1">
+                        <a:prstTxWarp prst="textNoShape">
+                          <a:avLst/>
+                        </a:prstTxWarp>
+                        <a:spAutoFit/>
+                      </wps:bodyPr>
+                    </wps:wsp>
+                  </a:graphicData>
+                </a:graphic>
+              </wp:anchor>
+            </w:drawing>
+          </mc:Choice>
+          <mc:Fallback>
+            <w:pict>
+              <v:shape w14:anchorId="3059F2F1" id="Text Box 3" o:spid="_x0000_s1028" type="#_x0000_t202" style="position:absolute;margin-left:0;margin-top:0;width:2in;height:2in;z-index:251663360;visibility:visible;mso-wrap-style:none;mso-wrap-distance-left:9pt;mso-wrap-distance-top:0;mso-wrap-distance-right:9pt;mso-wrap-distance-bottom:0;mso-position-horizontal:absolute;mso-position-horizontal-relative:text;mso-position-vertical:absolute;mso-position-vertical-relative:text;v-text-anchor:top" o:gfxdata="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" filled="f" stroked="f">
+                <v:fill o:detectmouseclick="t"/>
+                <v:textbox style="mso-fit-shape-to-text:t">
+                  <w:txbxContent>
+                    <w:p>
+                      <w:pPr>
+                        <w:tabs>
+                          <w:tab w:val="left" w:pos="3044"/>
+                        </w:tabs>
+                        <w:jc w:val="center"/>
+                        <w:rPr>
+                          <w:sz w:val="72"/>
+                          <w:szCs w:val="72"/>
+                          <w:lang w:val="en-US"/>
+                          <w14:textOutline w14:w="0" w14:cap="flat" w14:cmpd="sng" w14:algn="ctr">
+                            <w14:noFill/>
+                            <w14:prstDash w14:val="solid"/>
+                            <w14:round/>
+                          </w14:textOutline>
+                          <w14:textFill>
+                            <w14:gradFill>
+                              <w14:gsLst>
+                                <w14:gs w14:pos="21000">
+                                  <w14:srgbClr w14:val="53575C"/>
+                                </w14:gs>
+                                <w14:gs w14:pos="88000">
+                                  <w14:srgbClr w14:val="C5C7CA"/>
+                                </w14:gs>
+                              </w14:gsLst>
+                              <w14:lin w14:ang="5400000" w14:scaled="0"/>
+                            </w14:gradFill>
+                          </w14:textFill>
+                        </w:rPr>
+                      </w:pPr>
+                      <w:r>
+                        <w:rPr>
+                          <w:sz w:val="72"/>
+                          <w:szCs w:val="72"/>
+                          <w:lang w:val="en-US"/>
+                          <w14:textOutline w14:w="0" w14:cap="flat" w14:cmpd="sng" w14:algn="ctr">
+                            <w14:noFill/>
+                            <w14:prstDash w14:val="solid"/>
+                            <w14:round/>
+                          </w14:textOutline>
+                          <w14:textFill>
+                            <w14:gradFill>
+                              <w14:gsLst>
+                                <w14:gs w14:pos="21000">
+                                  <w14:srgbClr w14:val="53575C"/>
+                                </w14:gs>
+                                <w14:gs w14:pos="88000">
+                                  <w14:srgbClr w14:val="C5C7CA"/>
+                                </w14:gs>
+                              </w14:gsLst>
+                              <w14:lin w14:ang="5400000" w14:scaled="0"/>
+                            </w14:gradFill>
+                          </w14:textFill>
+                        </w:rPr>
+                        <w:t>FEATURE ENGINEERING</w:t>
+                      </w:r>
+                    </w:p>
+                  </w:txbxContent>
+                </v:textbox>
+              </v:shape>
+            </w:pict>
+          </mc:Fallback>
+        </mc:AlternateContent>
+      </w:r>
+    </w:p>
+    <w:p/>
+    <w:p/>
+    <w:p>
+      <w:pPr>
+        <w:spacing w:beforeAutospacing="1" w:after="100" w:afterAutospacing="1" w:line="240" w:lineRule="auto"/>
+        <w:rPr>
+          <w:rFonts w:ascii="Times New Roman" w:eastAsia="Times New Roman" w:hAnsi="Times New Roman" w:cs="Times New Roman"/>
+          <w:sz w:val="24"/>
+          <w:szCs w:val="24"/>
+          <w:lang w:eastAsia="en-IN"/>
+        </w:rPr>
+      </w:pPr>
       <w:bookmarkStart w:id="0" w:name="_GoBack"/>
       <w:bookmarkEnd w:id="0"/>
       <w:r>
-        <w:t xml:space="preserve"> is NOT:</w:t>
-      </w:r>
-      <w:r>
+        <w:rPr>
+          <w:rFonts w:ascii="Times New Roman" w:eastAsia="Times New Roman" w:hAnsi="Times New Roman" w:cs="Times New Roman"/>
+          <w:sz w:val="24"/>
+          <w:szCs w:val="24"/>
+          <w:lang w:eastAsia="en-IN"/>
+        </w:rPr>
+        <w:t xml:space="preserve">taking raw/clean columns and creating </w:t>
+      </w:r>
+      <w:r>
+        <w:rPr>
+          <w:rFonts w:ascii="Times New Roman" w:eastAsia="Times New Roman" w:hAnsi="Times New Roman" w:cs="Times New Roman"/>
+          <w:b/>
+          <w:bCs/>
+          <w:sz w:val="24"/>
+          <w:szCs w:val="24"/>
+          <w:lang w:eastAsia="en-IN"/>
+        </w:rPr>
+        <w:t>more meaningful derived metrics</w:t>
+      </w:r>
+    </w:p>
+    <w:p>
+      <w:pPr>
+        <w:spacing w:before="100" w:beforeAutospacing="1" w:after="100" w:afterAutospacing="1" w:line="240" w:lineRule="auto"/>
+        <w:rPr>
+          <w:rFonts w:ascii="Times New Roman" w:eastAsia="Times New Roman" w:hAnsi="Times New Roman" w:cs="Times New Roman"/>
+          <w:sz w:val="24"/>
+          <w:szCs w:val="24"/>
+          <w:lang w:eastAsia="en-IN"/>
+        </w:rPr>
+      </w:pPr>
+      <w:r>
+        <w:rPr>
+          <w:rFonts w:ascii="Times New Roman" w:eastAsia="Times New Roman" w:hAnsi="Times New Roman" w:cs="Times New Roman"/>
+          <w:sz w:val="24"/>
+          <w:szCs w:val="24"/>
+          <w:lang w:eastAsia="en-IN"/>
+        </w:rPr>
+        <w:t>Instead of only using:</w:t>
+      </w:r>
+    </w:p>
+    <w:p>
+      <w:pPr>
+        <w:numPr>
+          <w:ilvl w:val="0"/>
+          <w:numId w:val="26"/>
+        </w:numPr>
+        <w:spacing w:before="100" w:beforeAutospacing="1" w:after="100" w:afterAutospacing="1" w:line="240" w:lineRule="auto"/>
+        <w:rPr>
+          <w:rFonts w:ascii="Times New Roman" w:eastAsia="Times New Roman" w:hAnsi="Times New Roman" w:cs="Times New Roman"/>
+          <w:sz w:val="24"/>
+          <w:szCs w:val="24"/>
+          <w:lang w:eastAsia="en-IN"/>
+        </w:rPr>
+      </w:pPr>
+      <w:proofErr w:type="spellStart"/>
+      <w:r>
+        <w:rPr>
+          <w:rFonts w:ascii="Times New Roman" w:eastAsia="Times New Roman" w:hAnsi="Times New Roman" w:cs="Times New Roman"/>
+          <w:sz w:val="24"/>
+          <w:szCs w:val="24"/>
+          <w:lang w:eastAsia="en-IN"/>
+        </w:rPr>
+        <w:t>sleep_hours</w:t>
+      </w:r>
+      <w:proofErr w:type="spellEnd"/>
+      <w:r>
+        <w:rPr>
+          <w:rFonts w:ascii="Times New Roman" w:eastAsia="Times New Roman" w:hAnsi="Times New Roman" w:cs="Times New Roman"/>
+          <w:sz w:val="24"/>
+          <w:szCs w:val="24"/>
+          <w:lang w:eastAsia="en-IN"/>
+        </w:rPr>
         <w:t xml:space="preserve"> </w:t>
       </w:r>
-      <w:r>
-        <w:t>“fill everything”</w:t>
-      </w:r>
-    </w:p>
-    <w:p>
-      <w:pPr>
-        <w:pStyle w:val="IntenseQuote"/>
-      </w:pPr>
-      <w:r>
-        <w:rPr>
-          <w:rFonts w:ascii="Segoe UI Symbol" w:hAnsi="Segoe UI Symbol" w:cs="Segoe UI Symbol"/>
-        </w:rPr>
-        <w:t>👉</w:t>
-      </w:r>
-      <w:r>
-        <w:t xml:space="preserve"> It IS</w:t>
-      </w:r>
-      <w:r>
-        <w:t xml:space="preserve">: </w:t>
-      </w:r>
-      <w:r>
-        <w:t>“understand what each column represents, then decide”</w:t>
-      </w:r>
+    </w:p>
+    <w:p>
+      <w:pPr>
+        <w:numPr>
+          <w:ilvl w:val="0"/>
+          <w:numId w:val="26"/>
+        </w:numPr>
+        <w:spacing w:before="100" w:beforeAutospacing="1" w:after="100" w:afterAutospacing="1" w:line="240" w:lineRule="auto"/>
+        <w:rPr>
+          <w:rFonts w:ascii="Times New Roman" w:eastAsia="Times New Roman" w:hAnsi="Times New Roman" w:cs="Times New Roman"/>
+          <w:sz w:val="24"/>
+          <w:szCs w:val="24"/>
+          <w:lang w:eastAsia="en-IN"/>
+        </w:rPr>
+      </w:pPr>
+      <w:proofErr w:type="spellStart"/>
+      <w:r>
+        <w:rPr>
+          <w:rFonts w:ascii="Times New Roman" w:eastAsia="Times New Roman" w:hAnsi="Times New Roman" w:cs="Times New Roman"/>
+          <w:sz w:val="24"/>
+          <w:szCs w:val="24"/>
+          <w:lang w:eastAsia="en-IN"/>
+        </w:rPr>
+        <w:t>study_hours</w:t>
+      </w:r>
+      <w:proofErr w:type="spellEnd"/>
+      <w:r>
+        <w:rPr>
+          <w:rFonts w:ascii="Times New Roman" w:eastAsia="Times New Roman" w:hAnsi="Times New Roman" w:cs="Times New Roman"/>
+          <w:sz w:val="24"/>
+          <w:szCs w:val="24"/>
+          <w:lang w:eastAsia="en-IN"/>
+        </w:rPr>
+        <w:t xml:space="preserve"> </w:t>
+      </w:r>
+    </w:p>
+    <w:p>
+      <w:pPr>
+        <w:numPr>
+          <w:ilvl w:val="0"/>
+          <w:numId w:val="26"/>
+        </w:numPr>
+        <w:spacing w:before="100" w:beforeAutospacing="1" w:after="100" w:afterAutospacing="1" w:line="240" w:lineRule="auto"/>
+        <w:rPr>
+          <w:rFonts w:ascii="Times New Roman" w:eastAsia="Times New Roman" w:hAnsi="Times New Roman" w:cs="Times New Roman"/>
+          <w:sz w:val="24"/>
+          <w:szCs w:val="24"/>
+          <w:lang w:eastAsia="en-IN"/>
+        </w:rPr>
+      </w:pPr>
+      <w:proofErr w:type="spellStart"/>
+      <w:r>
+        <w:rPr>
+          <w:rFonts w:ascii="Times New Roman" w:eastAsia="Times New Roman" w:hAnsi="Times New Roman" w:cs="Times New Roman"/>
+          <w:sz w:val="24"/>
+          <w:szCs w:val="24"/>
+          <w:lang w:eastAsia="en-IN"/>
+        </w:rPr>
+        <w:t>stress_level</w:t>
+      </w:r>
+      <w:proofErr w:type="spellEnd"/>
+      <w:r>
+        <w:rPr>
+          <w:rFonts w:ascii="Times New Roman" w:eastAsia="Times New Roman" w:hAnsi="Times New Roman" w:cs="Times New Roman"/>
+          <w:sz w:val="24"/>
+          <w:szCs w:val="24"/>
+          <w:lang w:eastAsia="en-IN"/>
+        </w:rPr>
+        <w:t xml:space="preserve"> </w:t>
+      </w:r>
+    </w:p>
+    <w:p>
+      <w:pPr>
+        <w:numPr>
+          <w:ilvl w:val="0"/>
+          <w:numId w:val="26"/>
+        </w:numPr>
+        <w:spacing w:before="100" w:beforeAutospacing="1" w:after="100" w:afterAutospacing="1" w:line="240" w:lineRule="auto"/>
+        <w:rPr>
+          <w:rFonts w:ascii="Times New Roman" w:eastAsia="Times New Roman" w:hAnsi="Times New Roman" w:cs="Times New Roman"/>
+          <w:sz w:val="24"/>
+          <w:szCs w:val="24"/>
+          <w:lang w:eastAsia="en-IN"/>
+        </w:rPr>
+      </w:pPr>
+      <w:proofErr w:type="spellStart"/>
+      <w:r>
+        <w:rPr>
+          <w:rFonts w:ascii="Times New Roman" w:eastAsia="Times New Roman" w:hAnsi="Times New Roman" w:cs="Times New Roman"/>
+          <w:sz w:val="24"/>
+          <w:szCs w:val="24"/>
+          <w:lang w:eastAsia="en-IN"/>
+        </w:rPr>
+        <w:t>screen_time_hours</w:t>
+      </w:r>
+      <w:proofErr w:type="spellEnd"/>
+      <w:r>
+        <w:rPr>
+          <w:rFonts w:ascii="Times New Roman" w:eastAsia="Times New Roman" w:hAnsi="Times New Roman" w:cs="Times New Roman"/>
+          <w:sz w:val="24"/>
+          <w:szCs w:val="24"/>
+          <w:lang w:eastAsia="en-IN"/>
+        </w:rPr>
+        <w:t xml:space="preserve"> </w:t>
+      </w:r>
+    </w:p>
+    <w:p>
+      <w:pPr>
+        <w:spacing w:before="100" w:beforeAutospacing="1" w:after="100" w:afterAutospacing="1" w:line="240" w:lineRule="auto"/>
+        <w:rPr>
+          <w:rFonts w:ascii="Times New Roman" w:eastAsia="Times New Roman" w:hAnsi="Times New Roman" w:cs="Times New Roman"/>
+          <w:sz w:val="24"/>
+          <w:szCs w:val="24"/>
+          <w:lang w:eastAsia="en-IN"/>
+        </w:rPr>
+      </w:pPr>
+      <w:r>
+        <w:rPr>
+          <w:rFonts w:ascii="Times New Roman" w:eastAsia="Times New Roman" w:hAnsi="Times New Roman" w:cs="Times New Roman"/>
+          <w:sz w:val="24"/>
+          <w:szCs w:val="24"/>
+          <w:lang w:eastAsia="en-IN"/>
+        </w:rPr>
+        <w:t>we create better indicators like:</w:t>
+      </w:r>
+    </w:p>
+    <w:p>
+      <w:pPr>
+        <w:numPr>
+          <w:ilvl w:val="0"/>
+          <w:numId w:val="27"/>
+        </w:numPr>
+        <w:spacing w:before="100" w:beforeAutospacing="1" w:after="100" w:afterAutospacing="1" w:line="240" w:lineRule="auto"/>
+        <w:rPr>
+          <w:rFonts w:ascii="Times New Roman" w:eastAsia="Times New Roman" w:hAnsi="Times New Roman" w:cs="Times New Roman"/>
+          <w:sz w:val="24"/>
+          <w:szCs w:val="24"/>
+          <w:lang w:eastAsia="en-IN"/>
+        </w:rPr>
+      </w:pPr>
+      <w:proofErr w:type="spellStart"/>
+      <w:r>
+        <w:rPr>
+          <w:rFonts w:ascii="Times New Roman" w:eastAsia="Times New Roman" w:hAnsi="Times New Roman" w:cs="Times New Roman"/>
+          <w:b/>
+          <w:bCs/>
+          <w:sz w:val="24"/>
+          <w:szCs w:val="24"/>
+          <w:lang w:eastAsia="en-IN"/>
+        </w:rPr>
+        <w:t>sleep_deficit</w:t>
+      </w:r>
+      <w:proofErr w:type="spellEnd"/>
+      <w:r>
+        <w:rPr>
+          <w:rFonts w:ascii="Times New Roman" w:eastAsia="Times New Roman" w:hAnsi="Times New Roman" w:cs="Times New Roman"/>
+          <w:sz w:val="24"/>
+          <w:szCs w:val="24"/>
+          <w:lang w:eastAsia="en-IN"/>
+        </w:rPr>
+        <w:t xml:space="preserve"> </w:t>
+      </w:r>
+    </w:p>
+    <w:p>
+      <w:pPr>
+        <w:numPr>
+          <w:ilvl w:val="0"/>
+          <w:numId w:val="27"/>
+        </w:numPr>
+        <w:spacing w:before="100" w:beforeAutospacing="1" w:after="100" w:afterAutospacing="1" w:line="240" w:lineRule="auto"/>
+        <w:rPr>
+          <w:rFonts w:ascii="Times New Roman" w:eastAsia="Times New Roman" w:hAnsi="Times New Roman" w:cs="Times New Roman"/>
+          <w:sz w:val="24"/>
+          <w:szCs w:val="24"/>
+          <w:lang w:eastAsia="en-IN"/>
+        </w:rPr>
+      </w:pPr>
+      <w:proofErr w:type="spellStart"/>
+      <w:r>
+        <w:rPr>
+          <w:rFonts w:ascii="Times New Roman" w:eastAsia="Times New Roman" w:hAnsi="Times New Roman" w:cs="Times New Roman"/>
+          <w:b/>
+          <w:bCs/>
+          <w:sz w:val="24"/>
+          <w:szCs w:val="24"/>
+          <w:lang w:eastAsia="en-IN"/>
+        </w:rPr>
+        <w:t>workload_index</w:t>
+      </w:r>
+      <w:proofErr w:type="spellEnd"/>
+      <w:r>
+        <w:rPr>
+          <w:rFonts w:ascii="Times New Roman" w:eastAsia="Times New Roman" w:hAnsi="Times New Roman" w:cs="Times New Roman"/>
+          <w:sz w:val="24"/>
+          <w:szCs w:val="24"/>
+          <w:lang w:eastAsia="en-IN"/>
+        </w:rPr>
+        <w:t xml:space="preserve"> </w:t>
+      </w:r>
+    </w:p>
+    <w:p>
+      <w:pPr>
+        <w:numPr>
+          <w:ilvl w:val="0"/>
+          <w:numId w:val="27"/>
+        </w:numPr>
+        <w:spacing w:before="100" w:beforeAutospacing="1" w:after="100" w:afterAutospacing="1" w:line="240" w:lineRule="auto"/>
+        <w:rPr>
+          <w:rFonts w:ascii="Times New Roman" w:eastAsia="Times New Roman" w:hAnsi="Times New Roman" w:cs="Times New Roman"/>
+          <w:sz w:val="24"/>
+          <w:szCs w:val="24"/>
+          <w:lang w:eastAsia="en-IN"/>
+        </w:rPr>
+      </w:pPr>
+      <w:proofErr w:type="spellStart"/>
+      <w:r>
+        <w:rPr>
+          <w:rFonts w:ascii="Times New Roman" w:eastAsia="Times New Roman" w:hAnsi="Times New Roman" w:cs="Times New Roman"/>
+          <w:b/>
+          <w:bCs/>
+          <w:sz w:val="24"/>
+          <w:szCs w:val="24"/>
+          <w:lang w:eastAsia="en-IN"/>
+        </w:rPr>
+        <w:t>distraction_ratio</w:t>
+      </w:r>
+      <w:proofErr w:type="spellEnd"/>
+      <w:r>
+        <w:rPr>
+          <w:rFonts w:ascii="Times New Roman" w:eastAsia="Times New Roman" w:hAnsi="Times New Roman" w:cs="Times New Roman"/>
+          <w:sz w:val="24"/>
+          <w:szCs w:val="24"/>
+          <w:lang w:eastAsia="en-IN"/>
+        </w:rPr>
+        <w:t xml:space="preserve"> </w:t>
+      </w:r>
+    </w:p>
+    <w:p>
+      <w:pPr>
+        <w:numPr>
+          <w:ilvl w:val="0"/>
+          <w:numId w:val="27"/>
+        </w:numPr>
+        <w:spacing w:before="100" w:beforeAutospacing="1" w:after="100" w:afterAutospacing="1" w:line="240" w:lineRule="auto"/>
+        <w:rPr>
+          <w:rFonts w:ascii="Times New Roman" w:eastAsia="Times New Roman" w:hAnsi="Times New Roman" w:cs="Times New Roman"/>
+          <w:sz w:val="24"/>
+          <w:szCs w:val="24"/>
+          <w:lang w:eastAsia="en-IN"/>
+        </w:rPr>
+      </w:pPr>
+      <w:proofErr w:type="spellStart"/>
+      <w:r>
+        <w:rPr>
+          <w:rFonts w:ascii="Times New Roman" w:eastAsia="Times New Roman" w:hAnsi="Times New Roman" w:cs="Times New Roman"/>
+          <w:b/>
+          <w:bCs/>
+          <w:sz w:val="24"/>
+          <w:szCs w:val="24"/>
+          <w:lang w:eastAsia="en-IN"/>
+        </w:rPr>
+        <w:t>recovery_balance</w:t>
+      </w:r>
+      <w:proofErr w:type="spellEnd"/>
+      <w:r>
+        <w:rPr>
+          <w:rFonts w:ascii="Times New Roman" w:eastAsia="Times New Roman" w:hAnsi="Times New Roman" w:cs="Times New Roman"/>
+          <w:sz w:val="24"/>
+          <w:szCs w:val="24"/>
+          <w:lang w:eastAsia="en-IN"/>
+        </w:rPr>
+        <w:t xml:space="preserve"> </w:t>
+      </w:r>
+    </w:p>
+    <w:p>
+      <w:pPr>
+        <w:numPr>
+          <w:ilvl w:val="0"/>
+          <w:numId w:val="27"/>
+        </w:numPr>
+        <w:spacing w:before="100" w:beforeAutospacing="1" w:after="100" w:afterAutospacing="1" w:line="240" w:lineRule="auto"/>
+        <w:rPr>
+          <w:rFonts w:ascii="Times New Roman" w:eastAsia="Times New Roman" w:hAnsi="Times New Roman" w:cs="Times New Roman"/>
+          <w:sz w:val="24"/>
+          <w:szCs w:val="24"/>
+          <w:lang w:eastAsia="en-IN"/>
+        </w:rPr>
+      </w:pPr>
+      <w:proofErr w:type="spellStart"/>
+      <w:r>
+        <w:rPr>
+          <w:rFonts w:ascii="Times New Roman" w:eastAsia="Times New Roman" w:hAnsi="Times New Roman" w:cs="Times New Roman"/>
+          <w:b/>
+          <w:bCs/>
+          <w:sz w:val="24"/>
+          <w:szCs w:val="24"/>
+          <w:lang w:eastAsia="en-IN"/>
+        </w:rPr>
+        <w:t>productivity_score</w:t>
+      </w:r>
+      <w:proofErr w:type="spellEnd"/>
+      <w:r>
+        <w:rPr>
+          <w:rFonts w:ascii="Times New Roman" w:eastAsia="Times New Roman" w:hAnsi="Times New Roman" w:cs="Times New Roman"/>
+          <w:sz w:val="24"/>
+          <w:szCs w:val="24"/>
+          <w:lang w:eastAsia="en-IN"/>
+        </w:rPr>
+        <w:t xml:space="preserve"> </w:t>
+      </w:r>
+    </w:p>
+    <w:p>
+      <w:pPr>
+        <w:numPr>
+          <w:ilvl w:val="0"/>
+          <w:numId w:val="27"/>
+        </w:numPr>
+        <w:spacing w:before="100" w:beforeAutospacing="1" w:after="100" w:afterAutospacing="1" w:line="240" w:lineRule="auto"/>
+        <w:rPr>
+          <w:rFonts w:ascii="Times New Roman" w:eastAsia="Times New Roman" w:hAnsi="Times New Roman" w:cs="Times New Roman"/>
+          <w:sz w:val="24"/>
+          <w:szCs w:val="24"/>
+          <w:lang w:eastAsia="en-IN"/>
+        </w:rPr>
+      </w:pPr>
+      <w:proofErr w:type="spellStart"/>
+      <w:r>
+        <w:rPr>
+          <w:rFonts w:ascii="Times New Roman" w:eastAsia="Times New Roman" w:hAnsi="Times New Roman" w:cs="Times New Roman"/>
+          <w:b/>
+          <w:bCs/>
+          <w:sz w:val="24"/>
+          <w:szCs w:val="24"/>
+          <w:lang w:eastAsia="en-IN"/>
+        </w:rPr>
+        <w:t>burnout_risk_score</w:t>
+      </w:r>
+      <w:proofErr w:type="spellEnd"/>
+      <w:r>
+        <w:rPr>
+          <w:rFonts w:ascii="Times New Roman" w:eastAsia="Times New Roman" w:hAnsi="Times New Roman" w:cs="Times New Roman"/>
+          <w:sz w:val="24"/>
+          <w:szCs w:val="24"/>
+          <w:lang w:eastAsia="en-IN"/>
+        </w:rPr>
+        <w:t xml:space="preserve"> </w:t>
+      </w:r>
+    </w:p>
+    <w:p>
+      <w:pPr>
+        <w:numPr>
+          <w:ilvl w:val="0"/>
+          <w:numId w:val="27"/>
+        </w:numPr>
+        <w:spacing w:before="100" w:beforeAutospacing="1" w:after="100" w:afterAutospacing="1" w:line="240" w:lineRule="auto"/>
+        <w:rPr>
+          <w:rFonts w:ascii="Times New Roman" w:eastAsia="Times New Roman" w:hAnsi="Times New Roman" w:cs="Times New Roman"/>
+          <w:sz w:val="24"/>
+          <w:szCs w:val="24"/>
+          <w:lang w:eastAsia="en-IN"/>
+        </w:rPr>
+      </w:pPr>
+      <w:proofErr w:type="spellStart"/>
+      <w:r>
+        <w:rPr>
+          <w:rFonts w:ascii="Times New Roman" w:eastAsia="Times New Roman" w:hAnsi="Times New Roman" w:cs="Times New Roman"/>
+          <w:b/>
+          <w:bCs/>
+          <w:sz w:val="24"/>
+          <w:szCs w:val="24"/>
+          <w:lang w:eastAsia="en-IN"/>
+        </w:rPr>
+        <w:t>burnout_category</w:t>
+      </w:r>
+      <w:proofErr w:type="spellEnd"/>
+      <w:r>
+        <w:rPr>
+          <w:rFonts w:ascii="Times New Roman" w:eastAsia="Times New Roman" w:hAnsi="Times New Roman" w:cs="Times New Roman"/>
+          <w:sz w:val="24"/>
+          <w:szCs w:val="24"/>
+          <w:lang w:eastAsia="en-IN"/>
+        </w:rPr>
+        <w:t xml:space="preserve"> </w:t>
+      </w:r>
+    </w:p>
+    <w:p>
+      <w:pPr>
+        <w:spacing w:before="100" w:beforeAutospacing="1" w:after="100" w:afterAutospacing="1" w:line="240" w:lineRule="auto"/>
+        <w:rPr>
+          <w:rFonts w:ascii="Times New Roman" w:eastAsia="Times New Roman" w:hAnsi="Times New Roman" w:cs="Times New Roman"/>
+          <w:sz w:val="24"/>
+          <w:szCs w:val="24"/>
+          <w:lang w:eastAsia="en-IN"/>
+        </w:rPr>
+      </w:pPr>
+      <w:r>
+        <w:rPr>
+          <w:rFonts w:ascii="Times New Roman" w:eastAsia="Times New Roman" w:hAnsi="Times New Roman" w:cs="Times New Roman"/>
+          <w:sz w:val="24"/>
+          <w:szCs w:val="24"/>
+          <w:lang w:eastAsia="en-IN"/>
+        </w:rPr>
+        <w:t>These are the features that actually power your insights.</w:t>
+      </w:r>
+    </w:p>
+    <w:p>
+      <w:pPr>
+        <w:spacing w:before="100" w:beforeAutospacing="1" w:after="100" w:afterAutospacing="1" w:line="240" w:lineRule="auto"/>
+        <w:rPr>
+          <w:rFonts w:ascii="Times New Roman" w:eastAsia="Times New Roman" w:hAnsi="Times New Roman" w:cs="Times New Roman"/>
+          <w:sz w:val="24"/>
+          <w:szCs w:val="24"/>
+          <w:lang w:eastAsia="en-IN"/>
+        </w:rPr>
+      </w:pPr>
+      <w:r>
+        <w:rPr>
+          <w:rFonts w:ascii="Times New Roman" w:eastAsia="Times New Roman" w:hAnsi="Times New Roman" w:cs="Times New Roman"/>
+          <w:sz w:val="24"/>
+          <w:szCs w:val="24"/>
+          <w:lang w:eastAsia="en-IN"/>
+        </w:rPr>
+        <w:t xml:space="preserve">cleaned dataset tells us </w:t>
+      </w:r>
+      <w:r>
+        <w:rPr>
+          <w:rFonts w:ascii="Times New Roman" w:eastAsia="Times New Roman" w:hAnsi="Times New Roman" w:cs="Times New Roman"/>
+          <w:b/>
+          <w:bCs/>
+          <w:sz w:val="24"/>
+          <w:szCs w:val="24"/>
+          <w:lang w:eastAsia="en-IN"/>
+        </w:rPr>
+        <w:t>what happened</w:t>
+      </w:r>
+      <w:r>
+        <w:rPr>
+          <w:rFonts w:ascii="Times New Roman" w:eastAsia="Times New Roman" w:hAnsi="Times New Roman" w:cs="Times New Roman"/>
+          <w:sz w:val="24"/>
+          <w:szCs w:val="24"/>
+          <w:lang w:eastAsia="en-IN"/>
+        </w:rPr>
+        <w:t>.</w:t>
+      </w:r>
+    </w:p>
+    <w:p>
+      <w:pPr>
+        <w:spacing w:before="100" w:beforeAutospacing="1" w:after="100" w:afterAutospacing="1" w:line="240" w:lineRule="auto"/>
+        <w:rPr>
+          <w:rFonts w:ascii="Times New Roman" w:eastAsia="Times New Roman" w:hAnsi="Times New Roman" w:cs="Times New Roman"/>
+          <w:sz w:val="24"/>
+          <w:szCs w:val="24"/>
+          <w:lang w:eastAsia="en-IN"/>
+        </w:rPr>
+      </w:pPr>
+      <w:r>
+        <w:rPr>
+          <w:rFonts w:ascii="Times New Roman" w:eastAsia="Times New Roman" w:hAnsi="Times New Roman" w:cs="Times New Roman"/>
+          <w:sz w:val="24"/>
+          <w:szCs w:val="24"/>
+          <w:lang w:eastAsia="en-IN"/>
+        </w:rPr>
+        <w:t>Feature engineering helps us answer:</w:t>
+      </w:r>
+    </w:p>
+    <w:p>
+      <w:pPr>
+        <w:numPr>
+          <w:ilvl w:val="0"/>
+          <w:numId w:val="28"/>
+        </w:numPr>
+        <w:spacing w:before="100" w:beforeAutospacing="1" w:after="100" w:afterAutospacing="1" w:line="240" w:lineRule="auto"/>
+        <w:rPr>
+          <w:rFonts w:ascii="Times New Roman" w:eastAsia="Times New Roman" w:hAnsi="Times New Roman" w:cs="Times New Roman"/>
+          <w:sz w:val="24"/>
+          <w:szCs w:val="24"/>
+          <w:lang w:eastAsia="en-IN"/>
+        </w:rPr>
+      </w:pPr>
+      <w:r>
+        <w:rPr>
+          <w:rFonts w:ascii="Times New Roman" w:eastAsia="Times New Roman" w:hAnsi="Times New Roman" w:cs="Times New Roman"/>
+          <w:sz w:val="24"/>
+          <w:szCs w:val="24"/>
+          <w:lang w:eastAsia="en-IN"/>
+        </w:rPr>
+        <w:t xml:space="preserve">how overloaded is a student? </w:t>
+      </w:r>
+    </w:p>
+    <w:p>
+      <w:pPr>
+        <w:numPr>
+          <w:ilvl w:val="0"/>
+          <w:numId w:val="28"/>
+        </w:numPr>
+        <w:spacing w:before="100" w:beforeAutospacing="1" w:after="100" w:afterAutospacing="1" w:line="240" w:lineRule="auto"/>
+        <w:rPr>
+          <w:rFonts w:ascii="Times New Roman" w:eastAsia="Times New Roman" w:hAnsi="Times New Roman" w:cs="Times New Roman"/>
+          <w:sz w:val="24"/>
+          <w:szCs w:val="24"/>
+          <w:lang w:eastAsia="en-IN"/>
+        </w:rPr>
+      </w:pPr>
+      <w:r>
+        <w:rPr>
+          <w:rFonts w:ascii="Times New Roman" w:eastAsia="Times New Roman" w:hAnsi="Times New Roman" w:cs="Times New Roman"/>
+          <w:sz w:val="24"/>
+          <w:szCs w:val="24"/>
+          <w:lang w:eastAsia="en-IN"/>
+        </w:rPr>
+        <w:t xml:space="preserve">how much are they recovering? </w:t>
+      </w:r>
+    </w:p>
+    <w:p>
+      <w:pPr>
+        <w:numPr>
+          <w:ilvl w:val="0"/>
+          <w:numId w:val="28"/>
+        </w:numPr>
+        <w:spacing w:before="100" w:beforeAutospacing="1" w:after="100" w:afterAutospacing="1" w:line="240" w:lineRule="auto"/>
+        <w:rPr>
+          <w:rFonts w:ascii="Times New Roman" w:eastAsia="Times New Roman" w:hAnsi="Times New Roman" w:cs="Times New Roman"/>
+          <w:sz w:val="24"/>
+          <w:szCs w:val="24"/>
+          <w:lang w:eastAsia="en-IN"/>
+        </w:rPr>
+      </w:pPr>
+      <w:r>
+        <w:rPr>
+          <w:rFonts w:ascii="Times New Roman" w:eastAsia="Times New Roman" w:hAnsi="Times New Roman" w:cs="Times New Roman"/>
+          <w:sz w:val="24"/>
+          <w:szCs w:val="24"/>
+          <w:lang w:eastAsia="en-IN"/>
+        </w:rPr>
+        <w:t xml:space="preserve">how distracted are they? </w:t>
+      </w:r>
+    </w:p>
+    <w:p>
+      <w:pPr>
+        <w:numPr>
+          <w:ilvl w:val="0"/>
+          <w:numId w:val="28"/>
+        </w:numPr>
+        <w:spacing w:before="100" w:beforeAutospacing="1" w:after="100" w:afterAutospacing="1" w:line="240" w:lineRule="auto"/>
+        <w:rPr>
+          <w:rFonts w:ascii="Times New Roman" w:eastAsia="Times New Roman" w:hAnsi="Times New Roman" w:cs="Times New Roman"/>
+          <w:sz w:val="24"/>
+          <w:szCs w:val="24"/>
+          <w:lang w:eastAsia="en-IN"/>
+        </w:rPr>
+      </w:pPr>
+      <w:r>
+        <w:rPr>
+          <w:rFonts w:ascii="Times New Roman" w:eastAsia="Times New Roman" w:hAnsi="Times New Roman" w:cs="Times New Roman"/>
+          <w:sz w:val="24"/>
+          <w:szCs w:val="24"/>
+          <w:lang w:eastAsia="en-IN"/>
+        </w:rPr>
+        <w:t xml:space="preserve">how likely are they to burn out? </w:t>
+      </w:r>
+    </w:p>
+    <w:p>
+      <w:pPr>
+        <w:numPr>
+          <w:ilvl w:val="0"/>
+          <w:numId w:val="28"/>
+        </w:numPr>
+        <w:spacing w:before="100" w:beforeAutospacing="1" w:after="100" w:afterAutospacing="1" w:line="240" w:lineRule="auto"/>
+        <w:rPr>
+          <w:rFonts w:ascii="Times New Roman" w:eastAsia="Times New Roman" w:hAnsi="Times New Roman" w:cs="Times New Roman"/>
+          <w:sz w:val="24"/>
+          <w:szCs w:val="24"/>
+          <w:lang w:eastAsia="en-IN"/>
+        </w:rPr>
+      </w:pPr>
+      <w:r>
+        <w:rPr>
+          <w:rFonts w:ascii="Times New Roman" w:eastAsia="Times New Roman" w:hAnsi="Times New Roman" w:cs="Times New Roman"/>
+          <w:sz w:val="24"/>
+          <w:szCs w:val="24"/>
+          <w:lang w:eastAsia="en-IN"/>
+        </w:rPr>
+        <w:t xml:space="preserve">why is productivity dropping? </w:t>
+      </w:r>
+    </w:p>
+    <w:p>
+      <w:pPr>
+        <w:spacing w:before="100" w:beforeAutospacing="1" w:after="100" w:afterAutospacing="1" w:line="240" w:lineRule="auto"/>
+        <w:rPr>
+          <w:rFonts w:ascii="Times New Roman" w:eastAsia="Times New Roman" w:hAnsi="Times New Roman" w:cs="Times New Roman"/>
+          <w:sz w:val="24"/>
+          <w:szCs w:val="24"/>
+          <w:lang w:eastAsia="en-IN"/>
+        </w:rPr>
+      </w:pPr>
+      <w:r>
+        <w:rPr>
+          <w:rFonts w:ascii="Times New Roman" w:eastAsia="Times New Roman" w:hAnsi="Times New Roman" w:cs="Times New Roman"/>
+          <w:sz w:val="24"/>
+          <w:szCs w:val="24"/>
+          <w:lang w:eastAsia="en-IN"/>
+        </w:rPr>
+        <w:t>So this is the step that turns your project from:</w:t>
+      </w:r>
+    </w:p>
+    <w:p>
+      <w:pPr>
+        <w:spacing w:beforeAutospacing="1" w:after="100" w:afterAutospacing="1" w:line="240" w:lineRule="auto"/>
+        <w:rPr>
+          <w:rFonts w:ascii="Times New Roman" w:eastAsia="Times New Roman" w:hAnsi="Times New Roman" w:cs="Times New Roman"/>
+          <w:sz w:val="24"/>
+          <w:szCs w:val="24"/>
+          <w:lang w:eastAsia="en-IN"/>
+        </w:rPr>
+      </w:pPr>
+      <w:r>
+        <w:rPr>
+          <w:rFonts w:ascii="Times New Roman" w:eastAsia="Times New Roman" w:hAnsi="Times New Roman" w:cs="Times New Roman"/>
+          <w:sz w:val="24"/>
+          <w:szCs w:val="24"/>
+          <w:lang w:eastAsia="en-IN"/>
+        </w:rPr>
+        <w:t>“I cleaned a dataset”</w:t>
+      </w:r>
+    </w:p>
+    <w:p>
+      <w:pPr>
+        <w:spacing w:before="100" w:beforeAutospacing="1" w:after="100" w:afterAutospacing="1" w:line="240" w:lineRule="auto"/>
+        <w:rPr>
+          <w:rFonts w:ascii="Times New Roman" w:eastAsia="Times New Roman" w:hAnsi="Times New Roman" w:cs="Times New Roman"/>
+          <w:sz w:val="24"/>
+          <w:szCs w:val="24"/>
+          <w:lang w:eastAsia="en-IN"/>
+        </w:rPr>
+      </w:pPr>
+      <w:r>
+        <w:rPr>
+          <w:rFonts w:ascii="Times New Roman" w:eastAsia="Times New Roman" w:hAnsi="Times New Roman" w:cs="Times New Roman"/>
+          <w:sz w:val="24"/>
+          <w:szCs w:val="24"/>
+          <w:lang w:eastAsia="en-IN"/>
+        </w:rPr>
+        <w:t>into:</w:t>
+      </w:r>
+    </w:p>
+    <w:p>
+      <w:pPr>
+        <w:spacing w:beforeAutospacing="1" w:after="100" w:afterAutospacing="1" w:line="240" w:lineRule="auto"/>
+        <w:rPr>
+          <w:rFonts w:ascii="Times New Roman" w:eastAsia="Times New Roman" w:hAnsi="Times New Roman" w:cs="Times New Roman"/>
+          <w:sz w:val="24"/>
+          <w:szCs w:val="24"/>
+          <w:lang w:eastAsia="en-IN"/>
+        </w:rPr>
+      </w:pPr>
+      <w:r>
+        <w:rPr>
+          <w:rFonts w:ascii="Times New Roman" w:eastAsia="Times New Roman" w:hAnsi="Times New Roman" w:cs="Times New Roman"/>
+          <w:sz w:val="24"/>
+          <w:szCs w:val="24"/>
+          <w:lang w:eastAsia="en-IN"/>
+        </w:rPr>
+        <w:t>“I built an analytics system that quantifies burnout risk and productivity patterns.”</w:t>
+      </w:r>
+    </w:p>
+    <w:p/>
+    <w:p/>
+    <w:p/>
+    <w:p/>
+    <w:p>
+      <w:pPr>
+        <w:pStyle w:val="Heading2"/>
+      </w:pPr>
+      <w:r>
+        <w:lastRenderedPageBreak/>
+        <w:t>1. Sleep Deficit</w:t>
+      </w:r>
+    </w:p>
+    <w:p>
+      <w:pPr>
+        <w:pStyle w:val="NormalWeb"/>
+      </w:pPr>
+      <w:r>
+        <w:t>Formula idea:</w:t>
+      </w:r>
+    </w:p>
+    <w:p>
+      <w:pPr>
+        <w:pStyle w:val="HTMLPreformatted"/>
+      </w:pPr>
+      <w:proofErr w:type="spellStart"/>
+      <w:r>
+        <w:t>sleep_deficit</w:t>
+      </w:r>
+      <w:proofErr w:type="spellEnd"/>
+      <w:r>
+        <w:t xml:space="preserve"> = </w:t>
+      </w:r>
+      <w:proofErr w:type="gramStart"/>
+      <w:r>
+        <w:t>max(</w:t>
+      </w:r>
+      <w:proofErr w:type="gramEnd"/>
+      <w:r>
+        <w:t xml:space="preserve">0, 8 - </w:t>
+      </w:r>
+      <w:proofErr w:type="spellStart"/>
+      <w:r>
+        <w:t>sleep_hours</w:t>
+      </w:r>
+      <w:proofErr w:type="spellEnd"/>
+      <w:r>
+        <w:t>)</w:t>
+      </w:r>
+    </w:p>
+    <w:p>
+      <w:pPr>
+        <w:pStyle w:val="NormalWeb"/>
+      </w:pPr>
+      <w:r>
+        <w:t>If a student sleeps:</w:t>
+      </w:r>
+    </w:p>
+    <w:p>
+      <w:pPr>
+        <w:numPr>
+          <w:ilvl w:val="0"/>
+          <w:numId w:val="29"/>
+        </w:numPr>
+        <w:spacing w:before="100" w:beforeAutospacing="1" w:after="100" w:afterAutospacing="1" w:line="240" w:lineRule="auto"/>
+      </w:pPr>
+      <w:r>
+        <w:t xml:space="preserve">8 hours → deficit = 0 </w:t>
+      </w:r>
+    </w:p>
+    <w:p>
+      <w:pPr>
+        <w:numPr>
+          <w:ilvl w:val="0"/>
+          <w:numId w:val="29"/>
+        </w:numPr>
+        <w:spacing w:before="100" w:beforeAutospacing="1" w:after="100" w:afterAutospacing="1" w:line="240" w:lineRule="auto"/>
+      </w:pPr>
+      <w:r>
+        <w:t xml:space="preserve">5.5 hours → deficit = 2.5 </w:t>
+      </w:r>
+    </w:p>
+    <w:p>
+      <w:pPr>
+        <w:pStyle w:val="Heading3"/>
+      </w:pPr>
+      <w:r>
+        <w:t>Why useful</w:t>
+      </w:r>
+    </w:p>
+    <w:p>
+      <w:pPr>
+        <w:pStyle w:val="NormalWeb"/>
+      </w:pPr>
+      <w:r>
+        <w:t xml:space="preserve">Because burnout is affected more by </w:t>
+      </w:r>
+      <w:r>
+        <w:rPr>
+          <w:rStyle w:val="Strong"/>
+        </w:rPr>
+        <w:t>lack of sleep</w:t>
+      </w:r>
+      <w:r>
+        <w:t xml:space="preserve"> than by sleep itself.</w:t>
+      </w:r>
+    </w:p>
+    <w:p>
+      <w:r>
+        <w:pict>
+          <v:rect id="_x0000_i1075" style="width:0;height:1.5pt" o:hralign="center" o:hrstd="t" o:hr="t" fillcolor="#a0a0a0" stroked="f"/>
+        </w:pict>
+      </w:r>
+    </w:p>
+    <w:p>
+      <w:pPr>
+        <w:pStyle w:val="Heading2"/>
+      </w:pPr>
+      <w:r>
+        <w:t>2. Workload Index</w:t>
+      </w:r>
+    </w:p>
+    <w:p>
+      <w:pPr>
+        <w:pStyle w:val="NormalWeb"/>
+      </w:pPr>
+      <w:r>
+        <w:t>A combined pressure metric using:</w:t>
+      </w:r>
+    </w:p>
+    <w:p>
+      <w:pPr>
+        <w:numPr>
+          <w:ilvl w:val="0"/>
+          <w:numId w:val="30"/>
+        </w:numPr>
+        <w:spacing w:before="100" w:beforeAutospacing="1" w:after="100" w:afterAutospacing="1" w:line="240" w:lineRule="auto"/>
+      </w:pPr>
+      <w:proofErr w:type="spellStart"/>
+      <w:r>
+        <w:t>study_hours</w:t>
+      </w:r>
+      <w:proofErr w:type="spellEnd"/>
+      <w:r>
+        <w:t xml:space="preserve"> </w:t>
+      </w:r>
+    </w:p>
+    <w:p>
+      <w:pPr>
+        <w:numPr>
+          <w:ilvl w:val="0"/>
+          <w:numId w:val="30"/>
+        </w:numPr>
+        <w:spacing w:before="100" w:beforeAutospacing="1" w:after="100" w:afterAutospacing="1" w:line="240" w:lineRule="auto"/>
+      </w:pPr>
+      <w:proofErr w:type="spellStart"/>
+      <w:r>
+        <w:t>lab_hours</w:t>
+      </w:r>
+      <w:proofErr w:type="spellEnd"/>
+      <w:r>
+        <w:t xml:space="preserve"> </w:t>
+      </w:r>
+    </w:p>
+    <w:p>
+      <w:pPr>
+        <w:numPr>
+          <w:ilvl w:val="0"/>
+          <w:numId w:val="30"/>
+        </w:numPr>
+        <w:spacing w:before="100" w:beforeAutospacing="1" w:after="100" w:afterAutospacing="1" w:line="240" w:lineRule="auto"/>
+      </w:pPr>
+      <w:proofErr w:type="spellStart"/>
+      <w:r>
+        <w:t>project_work_hours</w:t>
+      </w:r>
+      <w:proofErr w:type="spellEnd"/>
+      <w:r>
+        <w:t xml:space="preserve"> </w:t>
+      </w:r>
+    </w:p>
+    <w:p>
+      <w:pPr>
+        <w:numPr>
+          <w:ilvl w:val="0"/>
+          <w:numId w:val="30"/>
+        </w:numPr>
+        <w:spacing w:before="100" w:beforeAutospacing="1" w:after="100" w:afterAutospacing="1" w:line="240" w:lineRule="auto"/>
+      </w:pPr>
+      <w:proofErr w:type="spellStart"/>
+      <w:r>
+        <w:t>assignments_due_count</w:t>
+      </w:r>
+      <w:proofErr w:type="spellEnd"/>
+      <w:r>
+        <w:t xml:space="preserve"> </w:t>
+      </w:r>
+    </w:p>
+    <w:p>
+      <w:pPr>
+        <w:numPr>
+          <w:ilvl w:val="0"/>
+          <w:numId w:val="30"/>
+        </w:numPr>
+        <w:spacing w:before="100" w:beforeAutospacing="1" w:after="100" w:afterAutospacing="1" w:line="240" w:lineRule="auto"/>
+      </w:pPr>
+      <w:proofErr w:type="spellStart"/>
+      <w:r>
+        <w:t>tests_upcoming_count</w:t>
+      </w:r>
+      <w:proofErr w:type="spellEnd"/>
+      <w:r>
+        <w:t xml:space="preserve"> </w:t>
+      </w:r>
+    </w:p>
+    <w:p>
+      <w:pPr>
+        <w:pStyle w:val="Heading3"/>
+      </w:pPr>
+      <w:r>
+        <w:t>Why useful</w:t>
+      </w:r>
+    </w:p>
+    <w:p>
+      <w:pPr>
+        <w:pStyle w:val="NormalWeb"/>
+      </w:pPr>
+      <w:r>
+        <w:t xml:space="preserve">One single number is easier to </w:t>
+      </w:r>
+      <w:proofErr w:type="spellStart"/>
+      <w:r>
+        <w:t>analyze</w:t>
+      </w:r>
+      <w:proofErr w:type="spellEnd"/>
+      <w:r>
+        <w:t xml:space="preserve"> than 5 separate workload columns.</w:t>
+      </w:r>
+    </w:p>
+    <w:p>
+      <w:r>
+        <w:pict>
+          <v:rect id="_x0000_i1076" style="width:0;height:1.5pt" o:hralign="center" o:hrstd="t" o:hr="t" fillcolor="#a0a0a0" stroked="f"/>
+        </w:pict>
+      </w:r>
+    </w:p>
+    <w:p>
+      <w:pPr>
+        <w:pStyle w:val="Heading2"/>
+      </w:pPr>
+      <w:r>
+        <w:t>3. Distraction Ratio</w:t>
+      </w:r>
+    </w:p>
+    <w:p>
+      <w:pPr>
+        <w:pStyle w:val="NormalWeb"/>
+      </w:pPr>
+      <w:r>
+        <w:t>Formula:</w:t>
+      </w:r>
+    </w:p>
+    <w:p>
+      <w:pPr>
+        <w:pStyle w:val="HTMLPreformatted"/>
+      </w:pPr>
+      <w:proofErr w:type="spellStart"/>
+      <w:r>
+        <w:t>social_media_hours</w:t>
+      </w:r>
+      <w:proofErr w:type="spellEnd"/>
+      <w:r>
+        <w:t xml:space="preserve"> / </w:t>
+      </w:r>
+      <w:proofErr w:type="spellStart"/>
+      <w:r>
+        <w:t>screen_time_hours</w:t>
+      </w:r>
+      <w:proofErr w:type="spellEnd"/>
+    </w:p>
+    <w:p>
+      <w:pPr>
+        <w:pStyle w:val="Heading3"/>
+      </w:pPr>
+      <w:r>
+        <w:t>Why useful</w:t>
+      </w:r>
+    </w:p>
+    <w:p>
+      <w:pPr>
+        <w:pStyle w:val="NormalWeb"/>
+      </w:pPr>
+      <w:r>
+        <w:t>It tells us how much screen time is productive vs distracting.</w:t>
+      </w:r>
+    </w:p>
+    <w:p>
+      <w:pPr>
+        <w:pStyle w:val="NormalWeb"/>
+      </w:pPr>
+      <w:r>
+        <w:t>Example:</w:t>
+      </w:r>
+    </w:p>
+    <w:p>
+      <w:pPr>
+        <w:numPr>
+          <w:ilvl w:val="0"/>
+          <w:numId w:val="31"/>
+        </w:numPr>
+        <w:spacing w:before="100" w:beforeAutospacing="1" w:after="100" w:afterAutospacing="1" w:line="240" w:lineRule="auto"/>
+      </w:pPr>
+      <w:r>
+        <w:t xml:space="preserve">6 screen hours, 1 social hour → low distraction </w:t>
+      </w:r>
+    </w:p>
+    <w:p>
+      <w:pPr>
+        <w:numPr>
+          <w:ilvl w:val="0"/>
+          <w:numId w:val="31"/>
+        </w:numPr>
+        <w:spacing w:before="100" w:beforeAutospacing="1" w:after="100" w:afterAutospacing="1" w:line="240" w:lineRule="auto"/>
+      </w:pPr>
+      <w:r>
+        <w:t xml:space="preserve">6 screen hours, 5 social hours → high distraction </w:t>
+      </w:r>
+    </w:p>
+    <w:p>
+      <w:pPr>
+        <w:spacing w:after="0"/>
+      </w:pPr>
+      <w:r>
+        <w:lastRenderedPageBreak/>
+        <w:pict>
+          <v:rect id="_x0000_i1077" style="width:0;height:1.5pt" o:hralign="center" o:hrstd="t" o:hr="t" fillcolor="#a0a0a0" stroked="f"/>
+        </w:pict>
+      </w:r>
+    </w:p>
+    <w:p>
+      <w:pPr>
+        <w:pStyle w:val="Heading2"/>
+      </w:pPr>
+      <w:r>
+        <w:t>4. Recovery Balance</w:t>
+      </w:r>
+    </w:p>
+    <w:p>
+      <w:pPr>
+        <w:pStyle w:val="NormalWeb"/>
+      </w:pPr>
+      <w:r>
+        <w:t>Built from:</w:t>
+      </w:r>
+    </w:p>
+    <w:p>
+      <w:pPr>
+        <w:numPr>
+          <w:ilvl w:val="0"/>
+          <w:numId w:val="32"/>
+        </w:numPr>
+        <w:spacing w:before="100" w:beforeAutospacing="1" w:after="100" w:afterAutospacing="1" w:line="240" w:lineRule="auto"/>
+      </w:pPr>
+      <w:proofErr w:type="spellStart"/>
+      <w:r>
+        <w:t>sleep_hours</w:t>
+      </w:r>
+      <w:proofErr w:type="spellEnd"/>
+      <w:r>
+        <w:t xml:space="preserve"> </w:t>
+      </w:r>
+    </w:p>
+    <w:p>
+      <w:pPr>
+        <w:numPr>
+          <w:ilvl w:val="0"/>
+          <w:numId w:val="32"/>
+        </w:numPr>
+        <w:spacing w:before="100" w:beforeAutospacing="1" w:after="100" w:afterAutospacing="1" w:line="240" w:lineRule="auto"/>
+      </w:pPr>
+      <w:proofErr w:type="spellStart"/>
+      <w:r>
+        <w:t>break_hours</w:t>
+      </w:r>
+      <w:proofErr w:type="spellEnd"/>
+      <w:r>
+        <w:t xml:space="preserve"> </w:t>
+      </w:r>
+    </w:p>
+    <w:p>
+      <w:pPr>
+        <w:numPr>
+          <w:ilvl w:val="0"/>
+          <w:numId w:val="32"/>
+        </w:numPr>
+        <w:spacing w:before="100" w:beforeAutospacing="1" w:after="100" w:afterAutospacing="1" w:line="240" w:lineRule="auto"/>
+      </w:pPr>
+      <w:proofErr w:type="spellStart"/>
+      <w:r>
+        <w:t>physical_activity_minutes</w:t>
+      </w:r>
+      <w:proofErr w:type="spellEnd"/>
+      <w:r>
+        <w:t xml:space="preserve"> </w:t>
+      </w:r>
+    </w:p>
+    <w:p>
+      <w:pPr>
+        <w:pStyle w:val="Heading3"/>
+      </w:pPr>
+      <w:r>
+        <w:t>Why useful</w:t>
+      </w:r>
+    </w:p>
+    <w:p>
+      <w:pPr>
+        <w:pStyle w:val="NormalWeb"/>
+      </w:pPr>
+      <w:r>
+        <w:t>Burnout is not just about pressure. It is also about how much recovery the student gets.</w:t>
+      </w:r>
+    </w:p>
+    <w:p>
+      <w:r>
+        <w:pict>
+          <v:rect id="_x0000_i1078" style="width:0;height:1.5pt" o:hralign="center" o:hrstd="t" o:hr="t" fillcolor="#a0a0a0" stroked="f"/>
+        </w:pict>
+      </w:r>
+    </w:p>
+    <w:p>
+      <w:pPr>
+        <w:pStyle w:val="Heading2"/>
+      </w:pPr>
+      <w:r>
+        <w:t>5. Productivity Score</w:t>
+      </w:r>
+    </w:p>
+    <w:p>
+      <w:pPr>
+        <w:pStyle w:val="NormalWeb"/>
+      </w:pPr>
+      <w:r>
+        <w:t>A weighted score based on:</w:t>
+      </w:r>
+    </w:p>
+    <w:p>
+      <w:pPr>
+        <w:numPr>
+          <w:ilvl w:val="0"/>
+          <w:numId w:val="33"/>
+        </w:numPr>
+        <w:spacing w:before="100" w:beforeAutospacing="1" w:after="100" w:afterAutospacing="1" w:line="240" w:lineRule="auto"/>
+      </w:pPr>
+      <w:proofErr w:type="spellStart"/>
+      <w:r>
+        <w:t>study_hours</w:t>
+      </w:r>
+      <w:proofErr w:type="spellEnd"/>
+      <w:r>
+        <w:t xml:space="preserve"> </w:t>
+      </w:r>
+    </w:p>
+    <w:p>
+      <w:pPr>
+        <w:numPr>
+          <w:ilvl w:val="0"/>
+          <w:numId w:val="33"/>
+        </w:numPr>
+        <w:spacing w:before="100" w:beforeAutospacing="1" w:after="100" w:afterAutospacing="1" w:line="240" w:lineRule="auto"/>
+      </w:pPr>
+      <w:r>
+        <w:t xml:space="preserve">attendance </w:t>
+      </w:r>
+    </w:p>
+    <w:p>
+      <w:pPr>
+        <w:numPr>
+          <w:ilvl w:val="0"/>
+          <w:numId w:val="33"/>
+        </w:numPr>
+        <w:spacing w:before="100" w:beforeAutospacing="1" w:after="100" w:afterAutospacing="1" w:line="240" w:lineRule="auto"/>
+      </w:pPr>
+      <w:r>
+        <w:t xml:space="preserve">motivation </w:t>
+      </w:r>
+    </w:p>
+    <w:p>
+      <w:pPr>
+        <w:numPr>
+          <w:ilvl w:val="0"/>
+          <w:numId w:val="33"/>
+        </w:numPr>
+        <w:spacing w:before="100" w:beforeAutospacing="1" w:after="100" w:afterAutospacing="1" w:line="240" w:lineRule="auto"/>
+      </w:pPr>
+      <w:r>
+        <w:t xml:space="preserve">recovery </w:t>
+      </w:r>
+    </w:p>
+    <w:p>
+      <w:pPr>
+        <w:numPr>
+          <w:ilvl w:val="0"/>
+          <w:numId w:val="33"/>
+        </w:numPr>
+        <w:spacing w:before="100" w:beforeAutospacing="1" w:after="100" w:afterAutospacing="1" w:line="240" w:lineRule="auto"/>
+      </w:pPr>
+      <w:r>
+        <w:t xml:space="preserve">distraction </w:t>
+      </w:r>
+    </w:p>
+    <w:p>
+      <w:pPr>
+        <w:numPr>
+          <w:ilvl w:val="0"/>
+          <w:numId w:val="33"/>
+        </w:numPr>
+        <w:spacing w:before="100" w:beforeAutospacing="1" w:after="100" w:afterAutospacing="1" w:line="240" w:lineRule="auto"/>
+      </w:pPr>
+      <w:r>
+        <w:t xml:space="preserve">fatigue </w:t>
+      </w:r>
+    </w:p>
+    <w:p>
+      <w:pPr>
+        <w:numPr>
+          <w:ilvl w:val="0"/>
+          <w:numId w:val="33"/>
+        </w:numPr>
+        <w:spacing w:before="100" w:beforeAutospacing="1" w:after="100" w:afterAutospacing="1" w:line="240" w:lineRule="auto"/>
+      </w:pPr>
+      <w:r>
+        <w:t xml:space="preserve">workload balance </w:t>
+      </w:r>
+    </w:p>
+    <w:p>
+      <w:pPr>
+        <w:pStyle w:val="Heading3"/>
+      </w:pPr>
+      <w:r>
+        <w:t>Why useful</w:t>
+      </w:r>
+    </w:p>
+    <w:p>
+      <w:pPr>
+        <w:pStyle w:val="NormalWeb"/>
+      </w:pPr>
+      <w:r>
+        <w:t>This becomes one of your key dashboard KPIs.</w:t>
+      </w:r>
+    </w:p>
+    <w:p>
+      <w:r>
+        <w:pict>
+          <v:rect id="_x0000_i1079" style="width:0;height:1.5pt" o:hralign="center" o:hrstd="t" o:hr="t" fillcolor="#a0a0a0" stroked="f"/>
+        </w:pict>
+      </w:r>
+    </w:p>
+    <w:p>
+      <w:pPr>
+        <w:pStyle w:val="Heading2"/>
+      </w:pPr>
+      <w:r>
+        <w:t>6. Burnout Risk Score</w:t>
+      </w:r>
+    </w:p>
+    <w:p>
+      <w:pPr>
+        <w:pStyle w:val="NormalWeb"/>
+      </w:pPr>
+      <w:r>
+        <w:t>A weighted score based on:</w:t>
+      </w:r>
+    </w:p>
+    <w:p>
+      <w:pPr>
+        <w:numPr>
+          <w:ilvl w:val="0"/>
+          <w:numId w:val="34"/>
+        </w:numPr>
+        <w:spacing w:before="100" w:beforeAutospacing="1" w:after="100" w:afterAutospacing="1" w:line="240" w:lineRule="auto"/>
+      </w:pPr>
+      <w:r>
+        <w:t xml:space="preserve">sleep deficit </w:t>
+      </w:r>
+    </w:p>
+    <w:p>
+      <w:pPr>
+        <w:numPr>
+          <w:ilvl w:val="0"/>
+          <w:numId w:val="34"/>
+        </w:numPr>
+        <w:spacing w:before="100" w:beforeAutospacing="1" w:after="100" w:afterAutospacing="1" w:line="240" w:lineRule="auto"/>
+      </w:pPr>
+      <w:r>
+        <w:t xml:space="preserve">stress </w:t>
+      </w:r>
+    </w:p>
+    <w:p>
+      <w:pPr>
+        <w:numPr>
+          <w:ilvl w:val="0"/>
+          <w:numId w:val="34"/>
+        </w:numPr>
+        <w:spacing w:before="100" w:beforeAutospacing="1" w:after="100" w:afterAutospacing="1" w:line="240" w:lineRule="auto"/>
+      </w:pPr>
+      <w:r>
+        <w:t xml:space="preserve">fatigue </w:t>
+      </w:r>
+    </w:p>
+    <w:p>
+      <w:pPr>
+        <w:numPr>
+          <w:ilvl w:val="0"/>
+          <w:numId w:val="34"/>
+        </w:numPr>
+        <w:spacing w:before="100" w:beforeAutospacing="1" w:after="100" w:afterAutospacing="1" w:line="240" w:lineRule="auto"/>
+      </w:pPr>
+      <w:r>
+        <w:t xml:space="preserve">workload </w:t>
+      </w:r>
+    </w:p>
+    <w:p>
+      <w:pPr>
+        <w:numPr>
+          <w:ilvl w:val="0"/>
+          <w:numId w:val="34"/>
+        </w:numPr>
+        <w:spacing w:before="100" w:beforeAutospacing="1" w:after="100" w:afterAutospacing="1" w:line="240" w:lineRule="auto"/>
+      </w:pPr>
+      <w:r>
+        <w:t xml:space="preserve">deadline pressure </w:t>
+      </w:r>
+    </w:p>
+    <w:p>
+      <w:pPr>
+        <w:numPr>
+          <w:ilvl w:val="0"/>
+          <w:numId w:val="34"/>
+        </w:numPr>
+        <w:spacing w:before="100" w:beforeAutospacing="1" w:after="100" w:afterAutospacing="1" w:line="240" w:lineRule="auto"/>
+      </w:pPr>
+      <w:r>
+        <w:t xml:space="preserve">distraction </w:t>
+      </w:r>
+    </w:p>
+    <w:p>
+      <w:pPr>
+        <w:numPr>
+          <w:ilvl w:val="0"/>
+          <w:numId w:val="34"/>
+        </w:numPr>
+        <w:spacing w:before="100" w:beforeAutospacing="1" w:after="100" w:afterAutospacing="1" w:line="240" w:lineRule="auto"/>
+      </w:pPr>
+      <w:r>
+        <w:t xml:space="preserve">recovery balance </w:t>
+      </w:r>
+    </w:p>
+    <w:p>
+      <w:pPr>
+        <w:pStyle w:val="Heading3"/>
+      </w:pPr>
+      <w:r>
+        <w:t>Why useful</w:t>
+      </w:r>
+    </w:p>
+    <w:p>
+      <w:pPr>
+        <w:pStyle w:val="NormalWeb"/>
+      </w:pPr>
+      <w:r>
+        <w:lastRenderedPageBreak/>
+        <w:t>This is basically the core intelligence of your whole project.</w:t>
+      </w:r>
+    </w:p>
+    <w:p>
+      <w:r>
+        <w:pict>
+          <v:rect id="_x0000_i1080" style="width:0;height:1.5pt" o:hralign="center" o:hrstd="t" o:hr="t" fillcolor="#a0a0a0" stroked="f"/>
+        </w:pict>
+      </w:r>
+    </w:p>
+    <w:p>
+      <w:pPr>
+        <w:pStyle w:val="Heading2"/>
+      </w:pPr>
+      <w:r>
+        <w:t>7. Burnout Category</w:t>
+      </w:r>
+    </w:p>
+    <w:p>
+      <w:pPr>
+        <w:pStyle w:val="NormalWeb"/>
+      </w:pPr>
+      <w:r>
+        <w:t>Turn burnout score into labels:</w:t>
+      </w:r>
+    </w:p>
+    <w:p>
+      <w:pPr>
+        <w:numPr>
+          <w:ilvl w:val="0"/>
+          <w:numId w:val="35"/>
+        </w:numPr>
+        <w:spacing w:before="100" w:beforeAutospacing="1" w:after="100" w:afterAutospacing="1" w:line="240" w:lineRule="auto"/>
+      </w:pPr>
+      <w:r>
+        <w:rPr>
+          <w:rStyle w:val="Strong"/>
+        </w:rPr>
+        <w:t>0–39</w:t>
+      </w:r>
+      <w:r>
+        <w:t xml:space="preserve"> → Low </w:t>
+      </w:r>
+    </w:p>
+    <w:p>
+      <w:pPr>
+        <w:numPr>
+          <w:ilvl w:val="0"/>
+          <w:numId w:val="35"/>
+        </w:numPr>
+        <w:spacing w:before="100" w:beforeAutospacing="1" w:after="100" w:afterAutospacing="1" w:line="240" w:lineRule="auto"/>
+      </w:pPr>
+      <w:r>
+        <w:rPr>
+          <w:rStyle w:val="Strong"/>
+        </w:rPr>
+        <w:t>40–69</w:t>
+      </w:r>
+      <w:r>
+        <w:t xml:space="preserve"> → Moderate </w:t>
+      </w:r>
+    </w:p>
+    <w:p>
+      <w:pPr>
+        <w:numPr>
+          <w:ilvl w:val="0"/>
+          <w:numId w:val="35"/>
+        </w:numPr>
+        <w:spacing w:before="100" w:beforeAutospacing="1" w:after="100" w:afterAutospacing="1" w:line="240" w:lineRule="auto"/>
+      </w:pPr>
+      <w:r>
+        <w:rPr>
+          <w:rStyle w:val="Strong"/>
+        </w:rPr>
+        <w:t>70–100</w:t>
+      </w:r>
+      <w:r>
+        <w:t xml:space="preserve"> → High </w:t>
+      </w:r>
+    </w:p>
+    <w:p>
+      <w:pPr>
+        <w:pStyle w:val="Heading3"/>
+      </w:pPr>
+      <w:r>
+        <w:t>Why useful</w:t>
+      </w:r>
+    </w:p>
+    <w:p>
+      <w:pPr>
+        <w:pStyle w:val="NormalWeb"/>
+      </w:pPr>
+      <w:r>
+        <w:t>Very useful for Power BI filtering and decision-making visuals.</w:t>
+      </w:r>
+    </w:p>
+    <w:p>
+      <w:r>
+        <w:pict>
+          <v:rect id="_x0000_i1081" style="width:0;height:1.5pt" o:hralign="center" o:hrstd="t" o:hr="t" fillcolor="#a0a0a0" stroked="f"/>
+        </w:pict>
+      </w:r>
+    </w:p>
+    <w:p>
+      <w:pPr>
+        <w:pStyle w:val="Heading1"/>
+      </w:pPr>
+      <w:r>
+        <w:t xml:space="preserve">What happens after feature </w:t>
+      </w:r>
+      <w:proofErr w:type="gramStart"/>
+      <w:r>
+        <w:t>engineering</w:t>
+      </w:r>
+      <w:proofErr w:type="gramEnd"/>
+    </w:p>
+    <w:p>
+      <w:pPr>
+        <w:pStyle w:val="NormalWeb"/>
+      </w:pPr>
+      <w:r>
+        <w:t>Once this script works, your flow becomes:</w:t>
+      </w:r>
+    </w:p>
+    <w:p>
+      <w:pPr>
+        <w:pStyle w:val="Heading2"/>
+      </w:pPr>
+      <w:r>
+        <w:t>Before feature engineering</w:t>
+      </w:r>
+    </w:p>
+    <w:p>
+      <w:pPr>
+        <w:numPr>
+          <w:ilvl w:val="0"/>
+          <w:numId w:val="36"/>
+        </w:numPr>
+        <w:spacing w:before="100" w:beforeAutospacing="1" w:after="100" w:afterAutospacing="1" w:line="240" w:lineRule="auto"/>
+      </w:pPr>
+      <w:r>
+        <w:t xml:space="preserve">raw data </w:t>
+      </w:r>
+    </w:p>
+    <w:p>
+      <w:pPr>
+        <w:numPr>
+          <w:ilvl w:val="0"/>
+          <w:numId w:val="36"/>
+        </w:numPr>
+        <w:spacing w:before="100" w:beforeAutospacing="1" w:after="100" w:afterAutospacing="1" w:line="240" w:lineRule="auto"/>
+      </w:pPr>
+      <w:r>
+        <w:t xml:space="preserve">cleaned data </w:t>
+      </w:r>
+    </w:p>
+    <w:p>
+      <w:pPr>
+        <w:pStyle w:val="Heading2"/>
+      </w:pPr>
+      <w:r>
+        <w:t xml:space="preserve">After </w:t>
+      </w:r>
+      <w:r>
+        <w:t>feature engineering</w:t>
+      </w:r>
+    </w:p>
+    <w:p>
+      <w:pPr>
+        <w:numPr>
+          <w:ilvl w:val="0"/>
+          <w:numId w:val="37"/>
+        </w:numPr>
+        <w:spacing w:before="100" w:beforeAutospacing="1" w:after="100" w:afterAutospacing="1" w:line="240" w:lineRule="auto"/>
+      </w:pPr>
+      <w:r>
+        <w:t xml:space="preserve">processed analytics-ready data with burnout and productivity KPIs </w:t>
+      </w:r>
+    </w:p>
+    <w:p>
+      <w:pPr>
+        <w:spacing w:line="259" w:lineRule="auto"/>
+      </w:pPr>
+      <w:r>
+        <w:br w:type="page"/>
+      </w:r>
+    </w:p>
+    <w:p>
+      <w:r>
+        <w:rPr>
+          <w:noProof/>
+        </w:rPr>
+        <w:lastRenderedPageBreak/>
+        <mc:AlternateContent>
+          <mc:Choice Requires="wps">
+            <w:drawing>
+              <wp:anchor distT="0" distB="0" distL="114300" distR="114300" simplePos="0" relativeHeight="251665408" behindDoc="0" locked="0" layoutInCell="1" allowOverlap="1" wp14:anchorId="635B0E9D" wp14:editId="374C80EA">
+                <wp:simplePos x="0" y="0"/>
+                <wp:positionH relativeFrom="column">
+                  <wp:posOffset>0</wp:posOffset>
+                </wp:positionH>
+                <wp:positionV relativeFrom="paragraph">
+                  <wp:posOffset>0</wp:posOffset>
+                </wp:positionV>
+                <wp:extent cx="1828800" cy="1828800"/>
+                <wp:effectExtent l="0" t="0" r="0" b="0"/>
+                <wp:wrapNone/>
+                <wp:docPr id="4" name="Text Box 4"/>
+                <wp:cNvGraphicFramePr/>
+                <a:graphic xmlns:a="http://schemas.openxmlformats.org/drawingml/2006/main">
+                  <a:graphicData uri="http://schemas.microsoft.com/office/word/2010/wordprocessingShape">
+                    <wps:wsp>
+                      <wps:cNvSpPr txBox="1"/>
+                      <wps:spPr>
+                        <a:xfrm>
+                          <a:off x="0" y="0"/>
+                          <a:ext cx="1828800" cy="1828800"/>
+                        </a:xfrm>
+                        <a:prstGeom prst="rect">
+                          <a:avLst/>
+                        </a:prstGeom>
+                        <a:noFill/>
+                        <a:ln>
+                          <a:noFill/>
+                        </a:ln>
+                      </wps:spPr>
+                      <wps:txbx>
+                        <w:txbxContent>
+                          <w:p>
+                            <w:pPr>
+                              <w:jc w:val="center"/>
+                              <w:rPr>
+                                <w:sz w:val="72"/>
+                                <w:szCs w:val="72"/>
+                                <w:lang w:val="en-US"/>
+                                <w14:textOutline w14:w="0" w14:cap="flat" w14:cmpd="sng" w14:algn="ctr">
+                                  <w14:noFill/>
+                                  <w14:prstDash w14:val="solid"/>
+                                  <w14:round/>
+                                </w14:textOutline>
+                                <w14:textFill>
+                                  <w14:gradFill>
+                                    <w14:gsLst>
+                                      <w14:gs w14:pos="21000">
+                                        <w14:srgbClr w14:val="53575C"/>
+                                      </w14:gs>
+                                      <w14:gs w14:pos="88000">
+                                        <w14:srgbClr w14:val="C5C7CA"/>
+                                      </w14:gs>
+                                    </w14:gsLst>
+                                    <w14:lin w14:ang="5400000" w14:scaled="0"/>
+                                  </w14:gradFill>
+                                </w14:textFill>
+                              </w:rPr>
+                            </w:pPr>
+                            <w:r>
+                              <w:rPr>
+                                <w:sz w:val="72"/>
+                                <w:szCs w:val="72"/>
+                                <w:lang w:val="en-US"/>
+                                <w14:textOutline w14:w="0" w14:cap="flat" w14:cmpd="sng" w14:algn="ctr">
+                                  <w14:noFill/>
+                                  <w14:prstDash w14:val="solid"/>
+                                  <w14:round/>
+                                </w14:textOutline>
+                                <w14:textFill>
+                                  <w14:gradFill>
+                                    <w14:gsLst>
+                                      <w14:gs w14:pos="21000">
+                                        <w14:srgbClr w14:val="53575C"/>
+                                      </w14:gs>
+                                      <w14:gs w14:pos="88000">
+                                        <w14:srgbClr w14:val="C5C7CA"/>
+                                      </w14:gs>
+                                    </w14:gsLst>
+                                    <w14:lin w14:ang="5400000" w14:scaled="0"/>
+                                  </w14:gradFill>
+                                </w14:textFill>
+                              </w:rPr>
+                              <w:t>SQL AND DATABASE</w:t>
+                            </w:r>
+                          </w:p>
+                        </w:txbxContent>
+                      </wps:txbx>
+                      <wps:bodyPr rot="0" spcFirstLastPara="0" vertOverflow="overflow" horzOverflow="overflow" vert="horz" wrap="none" lIns="91440" tIns="45720" rIns="91440" bIns="45720" numCol="1" spcCol="0" rtlCol="0" fromWordArt="0" anchor="t" anchorCtr="0" forceAA="0" compatLnSpc="1">
+                        <a:prstTxWarp prst="textNoShape">
+                          <a:avLst/>
+                        </a:prstTxWarp>
+                        <a:spAutoFit/>
+                      </wps:bodyPr>
+                    </wps:wsp>
+                  </a:graphicData>
+                </a:graphic>
+              </wp:anchor>
+            </w:drawing>
+          </mc:Choice>
+          <mc:Fallback>
+            <w:pict>
+              <v:shape w14:anchorId="635B0E9D" id="Text Box 4" o:spid="_x0000_s1029" type="#_x0000_t202" style="position:absolute;margin-left:0;margin-top:0;width:2in;height:2in;z-index:251665408;visibility:visible;mso-wrap-style:none;mso-wrap-distance-left:9pt;mso-wrap-distance-top:0;mso-wrap-distance-right:9pt;mso-wrap-distance-bottom:0;mso-position-horizontal:absolute;mso-position-horizontal-relative:text;mso-position-vertical:absolute;mso-position-vertical-relative:text;v-text-anchor:top" o:gfxdata="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" filled="f" stroked="f">
+                <v:fill o:detectmouseclick="t"/>
+                <v:textbox style="mso-fit-shape-to-text:t">
+                  <w:txbxContent>
+                    <w:p>
+                      <w:pPr>
+                        <w:jc w:val="center"/>
+                        <w:rPr>
+                          <w:sz w:val="72"/>
+                          <w:szCs w:val="72"/>
+                          <w:lang w:val="en-US"/>
+                          <w14:textOutline w14:w="0" w14:cap="flat" w14:cmpd="sng" w14:algn="ctr">
+                            <w14:noFill/>
+                            <w14:prstDash w14:val="solid"/>
+                            <w14:round/>
+                          </w14:textOutline>
+                          <w14:textFill>
+                            <w14:gradFill>
+                              <w14:gsLst>
+                                <w14:gs w14:pos="21000">
+                                  <w14:srgbClr w14:val="53575C"/>
+                                </w14:gs>
+                                <w14:gs w14:pos="88000">
+                                  <w14:srgbClr w14:val="C5C7CA"/>
+                                </w14:gs>
+                              </w14:gsLst>
+                              <w14:lin w14:ang="5400000" w14:scaled="0"/>
+                            </w14:gradFill>
+                          </w14:textFill>
+                        </w:rPr>
+                      </w:pPr>
+                      <w:r>
+                        <w:rPr>
+                          <w:sz w:val="72"/>
+                          <w:szCs w:val="72"/>
+                          <w:lang w:val="en-US"/>
+                          <w14:textOutline w14:w="0" w14:cap="flat" w14:cmpd="sng" w14:algn="ctr">
+                            <w14:noFill/>
+                            <w14:prstDash w14:val="solid"/>
+                            <w14:round/>
+                          </w14:textOutline>
+                          <w14:textFill>
+                            <w14:gradFill>
+                              <w14:gsLst>
+                                <w14:gs w14:pos="21000">
+                                  <w14:srgbClr w14:val="53575C"/>
+                                </w14:gs>
+                                <w14:gs w14:pos="88000">
+                                  <w14:srgbClr w14:val="C5C7CA"/>
+                                </w14:gs>
+                              </w14:gsLst>
+                              <w14:lin w14:ang="5400000" w14:scaled="0"/>
+                            </w14:gradFill>
+                          </w14:textFill>
+                        </w:rPr>
+                        <w:t>SQL AND DATABASE</w:t>
+                      </w:r>
+                    </w:p>
+                  </w:txbxContent>
+                </v:textbox>
+              </v:shape>
+            </w:pict>
+          </mc:Fallback>
+        </mc:AlternateContent>
+      </w:r>
+    </w:p>
+    <w:p/>
+    <w:p>
+      <w:pPr>
+        <w:tabs>
+          <w:tab w:val="left" w:pos="1789"/>
+        </w:tabs>
+      </w:pPr>
+      <w:r>
+        <w:tab/>
+      </w:r>
+    </w:p>
+    <w:p>
+      <w:pPr>
+        <w:pStyle w:val="Heading2"/>
+      </w:pPr>
+      <w:r>
+        <w:t>1. Create SQL schema</w:t>
+      </w:r>
+    </w:p>
+    <w:p>
+      <w:pPr>
+        <w:pStyle w:val="NormalWeb"/>
+      </w:pPr>
+      <w:r>
+        <w:t>Tables like:</w:t>
+      </w:r>
+    </w:p>
+    <w:p>
+      <w:pPr>
+        <w:numPr>
+          <w:ilvl w:val="0"/>
+          <w:numId w:val="39"/>
+        </w:numPr>
+        <w:spacing w:before="100" w:beforeAutospacing="1" w:after="100" w:afterAutospacing="1" w:line="240" w:lineRule="auto"/>
+      </w:pPr>
+      <w:r>
+        <w:t xml:space="preserve">students </w:t>
+      </w:r>
+    </w:p>
+    <w:p>
+      <w:pPr>
+        <w:numPr>
+          <w:ilvl w:val="0"/>
+          <w:numId w:val="39"/>
+        </w:numPr>
+        <w:spacing w:before="100" w:beforeAutospacing="1" w:after="100" w:afterAutospacing="1" w:line="240" w:lineRule="auto"/>
+      </w:pPr>
+      <w:r>
+        <w:t xml:space="preserve">logs </w:t>
+      </w:r>
+    </w:p>
+    <w:p>
+      <w:pPr>
+        <w:numPr>
+          <w:ilvl w:val="0"/>
+          <w:numId w:val="39"/>
+        </w:numPr>
+        <w:spacing w:before="100" w:beforeAutospacing="1" w:after="100" w:afterAutospacing="1" w:line="240" w:lineRule="auto"/>
+      </w:pPr>
+      <w:r>
+        <w:t xml:space="preserve">analysis </w:t>
+      </w:r>
+    </w:p>
+    <w:p>
+      <w:pPr>
+        <w:pStyle w:val="Heading2"/>
+      </w:pPr>
+      <w:r>
+        <w:t>2. Load processed data into MySQL</w:t>
+      </w:r>
+    </w:p>
+    <w:p>
+      <w:pPr>
+        <w:pStyle w:val="Heading2"/>
+      </w:pPr>
+      <w:r>
+        <w:t>3. Write queries like:</w:t>
+      </w:r>
+    </w:p>
+    <w:p>
+      <w:pPr>
+        <w:numPr>
+          <w:ilvl w:val="0"/>
+          <w:numId w:val="40"/>
+        </w:numPr>
+        <w:spacing w:before="100" w:beforeAutospacing="1" w:after="100" w:afterAutospacing="1" w:line="240" w:lineRule="auto"/>
+      </w:pPr>
+      <w:proofErr w:type="spellStart"/>
+      <w:r>
+        <w:t>avg</w:t>
+      </w:r>
+      <w:proofErr w:type="spellEnd"/>
+      <w:r>
+        <w:t xml:space="preserve"> sleep by student </w:t>
+      </w:r>
+    </w:p>
+    <w:p>
+      <w:pPr>
+        <w:numPr>
+          <w:ilvl w:val="0"/>
+          <w:numId w:val="40"/>
+        </w:numPr>
+        <w:spacing w:before="100" w:beforeAutospacing="1" w:after="100" w:afterAutospacing="1" w:line="240" w:lineRule="auto"/>
+      </w:pPr>
+      <w:r>
+        <w:t xml:space="preserve">high burnout students </w:t>
+      </w:r>
+    </w:p>
+    <w:p>
+      <w:pPr>
+        <w:numPr>
+          <w:ilvl w:val="0"/>
+          <w:numId w:val="40"/>
+        </w:numPr>
+        <w:spacing w:before="100" w:beforeAutospacing="1" w:after="100" w:afterAutospacing="1" w:line="240" w:lineRule="auto"/>
+      </w:pPr>
+      <w:r>
+        <w:t xml:space="preserve">workload vs productivity </w:t>
+      </w:r>
+    </w:p>
+    <w:p>
+      <w:pPr>
+        <w:numPr>
+          <w:ilvl w:val="0"/>
+          <w:numId w:val="40"/>
+        </w:numPr>
+        <w:spacing w:before="100" w:beforeAutospacing="1" w:after="100" w:afterAutospacing="1" w:line="240" w:lineRule="auto"/>
+      </w:pPr>
+      <w:r>
+        <w:t>burnout trends over time</w:t>
+      </w:r>
+    </w:p>
+    <w:p>
+      <w:pPr>
+        <w:tabs>
+          <w:tab w:val="left" w:pos="1789"/>
+        </w:tabs>
+      </w:pPr>
     </w:p>
     <w:sectPr>
       <w:pgSz w:w="11906" w:h="16838"/>
@@ -10391,6 +12528,155 @@
     </w:lvl>
   </w:abstractNum>
   <w:abstractNum w:abstractNumId="1" w15:restartNumberingAfterBreak="0">
+    <w:nsid w:val="062C0906"/>
+    <w:multiLevelType w:val="multilevel"/>
+    <w:tmpl w:val="DA5A4C18"/>
+    <w:lvl w:ilvl="0">
+      <w:start w:val="1"/>
+      <w:numFmt w:val="bullet"/>
+      <w:lvlText w:val=""/>
+      <w:lvlJc w:val="left"/>
+      <w:pPr>
+        <w:tabs>
+          <w:tab w:val="num" w:pos="720"/>
+        </w:tabs>
+        <w:ind w:left="720" w:hanging="360"/>
+      </w:pPr>
+      <w:rPr>
+        <w:rFonts w:ascii="Symbol" w:hAnsi="Symbol" w:hint="default"/>
+        <w:sz w:val="20"/>
+      </w:rPr>
+    </w:lvl>
+    <w:lvl w:ilvl="1" w:tentative="1">
+      <w:start w:val="1"/>
+      <w:numFmt w:val="bullet"/>
+      <w:lvlText w:val="o"/>
+      <w:lvlJc w:val="left"/>
+      <w:pPr>
+        <w:tabs>
+          <w:tab w:val="num" w:pos="1440"/>
+        </w:tabs>
+        <w:ind w:left="1440" w:hanging="360"/>
+      </w:pPr>
+      <w:rPr>
+        <w:rFonts w:ascii="Courier New" w:hAnsi="Courier New" w:hint="default"/>
+        <w:sz w:val="20"/>
+      </w:rPr>
+    </w:lvl>
+    <w:lvl w:ilvl="2" w:tentative="1">
+      <w:start w:val="1"/>
+      <w:numFmt w:val="bullet"/>
+      <w:lvlText w:val=""/>
+      <w:lvlJc w:val="left"/>
+      <w:pPr>
+        <w:tabs>
+          <w:tab w:val="num" w:pos="2160"/>
+        </w:tabs>
+        <w:ind w:left="2160" w:hanging="360"/>
+      </w:pPr>
+      <w:rPr>
+        <w:rFonts w:ascii="Wingdings" w:hAnsi="Wingdings" w:hint="default"/>
+        <w:sz w:val="20"/>
+      </w:rPr>
+    </w:lvl>
+    <w:lvl w:ilvl="3" w:tentative="1">
+      <w:start w:val="1"/>
+      <w:numFmt w:val="bullet"/>
+      <w:lvlText w:val=""/>
+      <w:lvlJc w:val="left"/>
+      <w:pPr>
+        <w:tabs>
+          <w:tab w:val="num" w:pos="2880"/>
+        </w:tabs>
+        <w:ind w:left="2880" w:hanging="360"/>
+      </w:pPr>
+      <w:rPr>
+        <w:rFonts w:ascii="Wingdings" w:hAnsi="Wingdings" w:hint="default"/>
+        <w:sz w:val="20"/>
+      </w:rPr>
+    </w:lvl>
+    <w:lvl w:ilvl="4" w:tentative="1">
+      <w:start w:val="1"/>
+      <w:numFmt w:val="bullet"/>
+      <w:lvlText w:val=""/>
+      <w:lvlJc w:val="left"/>
+      <w:pPr>
+        <w:tabs>
+          <w:tab w:val="num" w:pos="3600"/>
+        </w:tabs>
+        <w:ind w:left="3600" w:hanging="360"/>
+      </w:pPr>
+      <w:rPr>
+        <w:rFonts w:ascii="Wingdings" w:hAnsi="Wingdings" w:hint="default"/>
+        <w:sz w:val="20"/>
+      </w:rPr>
+    </w:lvl>
+    <w:lvl w:ilvl="5" w:tentative="1">
+      <w:start w:val="1"/>
+      <w:numFmt w:val="bullet"/>
+      <w:lvlText w:val=""/>
+      <w:lvlJc w:val="left"/>
+      <w:pPr>
+        <w:tabs>
+          <w:tab w:val="num" w:pos="4320"/>
+        </w:tabs>
+        <w:ind w:left="4320" w:hanging="360"/>
+      </w:pPr>
+      <w:rPr>
+        <w:rFonts w:ascii="Wingdings" w:hAnsi="Wingdings" w:hint="default"/>
+        <w:sz w:val="20"/>
+      </w:rPr>
+    </w:lvl>
+    <w:lvl w:ilvl="6" w:tentative="1">
+      <w:start w:val="1"/>
+      <w:numFmt w:val="bullet"/>
+      <w:lvlText w:val=""/>
+      <w:lvlJc w:val="left"/>
+      <w:pPr>
+        <w:tabs>
+          <w:tab w:val="num" w:pos="5040"/>
+        </w:tabs>
+        <w:ind w:left="5040" w:hanging="360"/>
+      </w:pPr>
+      <w:rPr>
+        <w:rFonts w:ascii="Wingdings" w:hAnsi="Wingdings" w:hint="default"/>
+        <w:sz w:val="20"/>
+      </w:rPr>
+    </w:lvl>
+    <w:lvl w:ilvl="7" w:tentative="1">
+      <w:start w:val="1"/>
+      <w:numFmt w:val="bullet"/>
+      <w:lvlText w:val=""/>
+      <w:lvlJc w:val="left"/>
+      <w:pPr>
+        <w:tabs>
+          <w:tab w:val="num" w:pos="5760"/>
+        </w:tabs>
+        <w:ind w:left="5760" w:hanging="360"/>
+      </w:pPr>
+      <w:rPr>
+        <w:rFonts w:ascii="Wingdings" w:hAnsi="Wingdings" w:hint="default"/>
+        <w:sz w:val="20"/>
+      </w:rPr>
+    </w:lvl>
+    <w:lvl w:ilvl="8" w:tentative="1">
+      <w:start w:val="1"/>
+      <w:numFmt w:val="bullet"/>
+      <w:lvlText w:val=""/>
+      <w:lvlJc w:val="left"/>
+      <w:pPr>
+        <w:tabs>
+          <w:tab w:val="num" w:pos="6480"/>
+        </w:tabs>
+        <w:ind w:left="6480" w:hanging="360"/>
+      </w:pPr>
+      <w:rPr>
+        <w:rFonts w:ascii="Wingdings" w:hAnsi="Wingdings" w:hint="default"/>
+        <w:sz w:val="20"/>
+      </w:rPr>
+    </w:lvl>
+  </w:abstractNum>
+  <w:abstractNum w:abstractNumId="2" w15:restartNumberingAfterBreak="0">
     <w:nsid w:val="08D16E65"/>
     <w:multiLevelType w:val="multilevel"/>
     <w:tmpl w:val="B7000922"/>
@@ -10539,7 +12825,7 @@
       </w:rPr>
     </w:lvl>
   </w:abstractNum>
-  <w:abstractNum w:abstractNumId="2" w15:restartNumberingAfterBreak="0">
+  <w:abstractNum w:abstractNumId="3" w15:restartNumberingAfterBreak="0">
     <w:nsid w:val="0F182D64"/>
     <w:multiLevelType w:val="multilevel"/>
     <w:tmpl w:val="3F6808C2"/>
@@ -10688,7 +12974,156 @@
       </w:rPr>
     </w:lvl>
   </w:abstractNum>
-  <w:abstractNum w:abstractNumId="3" w15:restartNumberingAfterBreak="0">
+  <w:abstractNum w:abstractNumId="4" w15:restartNumberingAfterBreak="0">
+    <w:nsid w:val="1AD34FF7"/>
+    <w:multiLevelType w:val="multilevel"/>
+    <w:tmpl w:val="0376423E"/>
+    <w:lvl w:ilvl="0">
+      <w:start w:val="1"/>
+      <w:numFmt w:val="bullet"/>
+      <w:lvlText w:val=""/>
+      <w:lvlJc w:val="left"/>
+      <w:pPr>
+        <w:tabs>
+          <w:tab w:val="num" w:pos="720"/>
+        </w:tabs>
+        <w:ind w:left="720" w:hanging="360"/>
+      </w:pPr>
+      <w:rPr>
+        <w:rFonts w:ascii="Symbol" w:hAnsi="Symbol" w:hint="default"/>
+        <w:sz w:val="20"/>
+      </w:rPr>
+    </w:lvl>
+    <w:lvl w:ilvl="1" w:tentative="1">
+      <w:start w:val="1"/>
+      <w:numFmt w:val="bullet"/>
+      <w:lvlText w:val="o"/>
+      <w:lvlJc w:val="left"/>
+      <w:pPr>
+        <w:tabs>
+          <w:tab w:val="num" w:pos="1440"/>
+        </w:tabs>
+        <w:ind w:left="1440" w:hanging="360"/>
+      </w:pPr>
+      <w:rPr>
+        <w:rFonts w:ascii="Courier New" w:hAnsi="Courier New" w:hint="default"/>
+        <w:sz w:val="20"/>
+      </w:rPr>
+    </w:lvl>
+    <w:lvl w:ilvl="2" w:tentative="1">
+      <w:start w:val="1"/>
+      <w:numFmt w:val="bullet"/>
+      <w:lvlText w:val=""/>
+      <w:lvlJc w:val="left"/>
+      <w:pPr>
+        <w:tabs>
+          <w:tab w:val="num" w:pos="2160"/>
+        </w:tabs>
+        <w:ind w:left="2160" w:hanging="360"/>
+      </w:pPr>
+      <w:rPr>
+        <w:rFonts w:ascii="Wingdings" w:hAnsi="Wingdings" w:hint="default"/>
+        <w:sz w:val="20"/>
+      </w:rPr>
+    </w:lvl>
+    <w:lvl w:ilvl="3" w:tentative="1">
+      <w:start w:val="1"/>
+      <w:numFmt w:val="bullet"/>
+      <w:lvlText w:val=""/>
+      <w:lvlJc w:val="left"/>
+      <w:pPr>
+        <w:tabs>
+          <w:tab w:val="num" w:pos="2880"/>
+        </w:tabs>
+        <w:ind w:left="2880" w:hanging="360"/>
+      </w:pPr>
+      <w:rPr>
+        <w:rFonts w:ascii="Wingdings" w:hAnsi="Wingdings" w:hint="default"/>
+        <w:sz w:val="20"/>
+      </w:rPr>
+    </w:lvl>
+    <w:lvl w:ilvl="4" w:tentative="1">
+      <w:start w:val="1"/>
+      <w:numFmt w:val="bullet"/>
+      <w:lvlText w:val=""/>
+      <w:lvlJc w:val="left"/>
+      <w:pPr>
+        <w:tabs>
+          <w:tab w:val="num" w:pos="3600"/>
+        </w:tabs>
+        <w:ind w:left="3600" w:hanging="360"/>
+      </w:pPr>
+      <w:rPr>
+        <w:rFonts w:ascii="Wingdings" w:hAnsi="Wingdings" w:hint="default"/>
+        <w:sz w:val="20"/>
+      </w:rPr>
+    </w:lvl>
+    <w:lvl w:ilvl="5" w:tentative="1">
+      <w:start w:val="1"/>
+      <w:numFmt w:val="bullet"/>
+      <w:lvlText w:val=""/>
+      <w:lvlJc w:val="left"/>
+      <w:pPr>
+        <w:tabs>
+          <w:tab w:val="num" w:pos="4320"/>
+        </w:tabs>
+        <w:ind w:left="4320" w:hanging="360"/>
+      </w:pPr>
+      <w:rPr>
+        <w:rFonts w:ascii="Wingdings" w:hAnsi="Wingdings" w:hint="default"/>
+        <w:sz w:val="20"/>
+      </w:rPr>
+    </w:lvl>
+    <w:lvl w:ilvl="6" w:tentative="1">
+      <w:start w:val="1"/>
+      <w:numFmt w:val="bullet"/>
+      <w:lvlText w:val=""/>
+      <w:lvlJc w:val="left"/>
+      <w:pPr>
+        <w:tabs>
+          <w:tab w:val="num" w:pos="5040"/>
+        </w:tabs>
+        <w:ind w:left="5040" w:hanging="360"/>
+      </w:pPr>
+      <w:rPr>
+        <w:rFonts w:ascii="Wingdings" w:hAnsi="Wingdings" w:hint="default"/>
+        <w:sz w:val="20"/>
+      </w:rPr>
+    </w:lvl>
+    <w:lvl w:ilvl="7" w:tentative="1">
+      <w:start w:val="1"/>
+      <w:numFmt w:val="bullet"/>
+      <w:lvlText w:val=""/>
+      <w:lvlJc w:val="left"/>
+      <w:pPr>
+        <w:tabs>
+          <w:tab w:val="num" w:pos="5760"/>
+        </w:tabs>
+        <w:ind w:left="5760" w:hanging="360"/>
+      </w:pPr>
+      <w:rPr>
+        <w:rFonts w:ascii="Wingdings" w:hAnsi="Wingdings" w:hint="default"/>
+        <w:sz w:val="20"/>
+      </w:rPr>
+    </w:lvl>
+    <w:lvl w:ilvl="8" w:tentative="1">
+      <w:start w:val="1"/>
+      <w:numFmt w:val="bullet"/>
+      <w:lvlText w:val=""/>
+      <w:lvlJc w:val="left"/>
+      <w:pPr>
+        <w:tabs>
+          <w:tab w:val="num" w:pos="6480"/>
+        </w:tabs>
+        <w:ind w:left="6480" w:hanging="360"/>
+      </w:pPr>
+      <w:rPr>
+        <w:rFonts w:ascii="Wingdings" w:hAnsi="Wingdings" w:hint="default"/>
+        <w:sz w:val="20"/>
+      </w:rPr>
+    </w:lvl>
+  </w:abstractNum>
+  <w:abstractNum w:abstractNumId="5" w15:restartNumberingAfterBreak="0">
     <w:nsid w:val="1B682AFD"/>
     <w:multiLevelType w:val="multilevel"/>
     <w:tmpl w:val="BB924C4E"/>
@@ -10837,7 +13272,156 @@
       </w:rPr>
     </w:lvl>
   </w:abstractNum>
-  <w:abstractNum w:abstractNumId="4" w15:restartNumberingAfterBreak="0">
+  <w:abstractNum w:abstractNumId="6" w15:restartNumberingAfterBreak="0">
+    <w:nsid w:val="1CB17B2F"/>
+    <w:multiLevelType w:val="multilevel"/>
+    <w:tmpl w:val="1D049FC0"/>
+    <w:lvl w:ilvl="0">
+      <w:start w:val="1"/>
+      <w:numFmt w:val="bullet"/>
+      <w:lvlText w:val=""/>
+      <w:lvlJc w:val="left"/>
+      <w:pPr>
+        <w:tabs>
+          <w:tab w:val="num" w:pos="720"/>
+        </w:tabs>
+        <w:ind w:left="720" w:hanging="360"/>
+      </w:pPr>
+      <w:rPr>
+        <w:rFonts w:ascii="Symbol" w:hAnsi="Symbol" w:hint="default"/>
+        <w:sz w:val="20"/>
+      </w:rPr>
+    </w:lvl>
+    <w:lvl w:ilvl="1" w:tentative="1">
+      <w:start w:val="1"/>
+      <w:numFmt w:val="bullet"/>
+      <w:lvlText w:val="o"/>
+      <w:lvlJc w:val="left"/>
+      <w:pPr>
+        <w:tabs>
+          <w:tab w:val="num" w:pos="1440"/>
+        </w:tabs>
+        <w:ind w:left="1440" w:hanging="360"/>
+      </w:pPr>
+      <w:rPr>
+        <w:rFonts w:ascii="Courier New" w:hAnsi="Courier New" w:hint="default"/>
+        <w:sz w:val="20"/>
+      </w:rPr>
+    </w:lvl>
+    <w:lvl w:ilvl="2" w:tentative="1">
+      <w:start w:val="1"/>
+      <w:numFmt w:val="bullet"/>
+      <w:lvlText w:val=""/>
+      <w:lvlJc w:val="left"/>
+      <w:pPr>
+        <w:tabs>
+          <w:tab w:val="num" w:pos="2160"/>
+        </w:tabs>
+        <w:ind w:left="2160" w:hanging="360"/>
+      </w:pPr>
+      <w:rPr>
+        <w:rFonts w:ascii="Wingdings" w:hAnsi="Wingdings" w:hint="default"/>
+        <w:sz w:val="20"/>
+      </w:rPr>
+    </w:lvl>
+    <w:lvl w:ilvl="3" w:tentative="1">
+      <w:start w:val="1"/>
+      <w:numFmt w:val="bullet"/>
+      <w:lvlText w:val=""/>
+      <w:lvlJc w:val="left"/>
+      <w:pPr>
+        <w:tabs>
+          <w:tab w:val="num" w:pos="2880"/>
+        </w:tabs>
+        <w:ind w:left="2880" w:hanging="360"/>
+      </w:pPr>
+      <w:rPr>
+        <w:rFonts w:ascii="Wingdings" w:hAnsi="Wingdings" w:hint="default"/>
+        <w:sz w:val="20"/>
+      </w:rPr>
+    </w:lvl>
+    <w:lvl w:ilvl="4" w:tentative="1">
+      <w:start w:val="1"/>
+      <w:numFmt w:val="bullet"/>
+      <w:lvlText w:val=""/>
+      <w:lvlJc w:val="left"/>
+      <w:pPr>
+        <w:tabs>
+          <w:tab w:val="num" w:pos="3600"/>
+        </w:tabs>
+        <w:ind w:left="3600" w:hanging="360"/>
+      </w:pPr>
+      <w:rPr>
+        <w:rFonts w:ascii="Wingdings" w:hAnsi="Wingdings" w:hint="default"/>
+        <w:sz w:val="20"/>
+      </w:rPr>
+    </w:lvl>
+    <w:lvl w:ilvl="5" w:tentative="1">
+      <w:start w:val="1"/>
+      <w:numFmt w:val="bullet"/>
+      <w:lvlText w:val=""/>
+      <w:lvlJc w:val="left"/>
+      <w:pPr>
+        <w:tabs>
+          <w:tab w:val="num" w:pos="4320"/>
+        </w:tabs>
+        <w:ind w:left="4320" w:hanging="360"/>
+      </w:pPr>
+      <w:rPr>
+        <w:rFonts w:ascii="Wingdings" w:hAnsi="Wingdings" w:hint="default"/>
+        <w:sz w:val="20"/>
+      </w:rPr>
+    </w:lvl>
+    <w:lvl w:ilvl="6" w:tentative="1">
+      <w:start w:val="1"/>
+      <w:numFmt w:val="bullet"/>
+      <w:lvlText w:val=""/>
+      <w:lvlJc w:val="left"/>
+      <w:pPr>
+        <w:tabs>
+          <w:tab w:val="num" w:pos="5040"/>
+        </w:tabs>
+        <w:ind w:left="5040" w:hanging="360"/>
+      </w:pPr>
+      <w:rPr>
+        <w:rFonts w:ascii="Wingdings" w:hAnsi="Wingdings" w:hint="default"/>
+        <w:sz w:val="20"/>
+      </w:rPr>
+    </w:lvl>
+    <w:lvl w:ilvl="7" w:tentative="1">
+      <w:start w:val="1"/>
+      <w:numFmt w:val="bullet"/>
+      <w:lvlText w:val=""/>
+      <w:lvlJc w:val="left"/>
+      <w:pPr>
+        <w:tabs>
+          <w:tab w:val="num" w:pos="5760"/>
+        </w:tabs>
+        <w:ind w:left="5760" w:hanging="360"/>
+      </w:pPr>
+      <w:rPr>
+        <w:rFonts w:ascii="Wingdings" w:hAnsi="Wingdings" w:hint="default"/>
+        <w:sz w:val="20"/>
+      </w:rPr>
+    </w:lvl>
+    <w:lvl w:ilvl="8" w:tentative="1">
+      <w:start w:val="1"/>
+      <w:numFmt w:val="bullet"/>
+      <w:lvlText w:val=""/>
+      <w:lvlJc w:val="left"/>
+      <w:pPr>
+        <w:tabs>
+          <w:tab w:val="num" w:pos="6480"/>
+        </w:tabs>
+        <w:ind w:left="6480" w:hanging="360"/>
+      </w:pPr>
+      <w:rPr>
+        <w:rFonts w:ascii="Wingdings" w:hAnsi="Wingdings" w:hint="default"/>
+        <w:sz w:val="20"/>
+      </w:rPr>
+    </w:lvl>
+  </w:abstractNum>
+  <w:abstractNum w:abstractNumId="7" w15:restartNumberingAfterBreak="0">
     <w:nsid w:val="1F0075EB"/>
     <w:multiLevelType w:val="multilevel"/>
     <w:tmpl w:val="356E28AE"/>
@@ -10986,7 +13570,7 @@
       </w:rPr>
     </w:lvl>
   </w:abstractNum>
-  <w:abstractNum w:abstractNumId="5" w15:restartNumberingAfterBreak="0">
+  <w:abstractNum w:abstractNumId="8" w15:restartNumberingAfterBreak="0">
     <w:nsid w:val="202F625E"/>
     <w:multiLevelType w:val="multilevel"/>
     <w:tmpl w:val="08DC4D04"/>
@@ -11135,7 +13719,454 @@
       </w:rPr>
     </w:lvl>
   </w:abstractNum>
-  <w:abstractNum w:abstractNumId="6" w15:restartNumberingAfterBreak="0">
+  <w:abstractNum w:abstractNumId="9" w15:restartNumberingAfterBreak="0">
+    <w:nsid w:val="21253F6A"/>
+    <w:multiLevelType w:val="multilevel"/>
+    <w:tmpl w:val="159A31D6"/>
+    <w:lvl w:ilvl="0">
+      <w:start w:val="1"/>
+      <w:numFmt w:val="bullet"/>
+      <w:lvlText w:val=""/>
+      <w:lvlJc w:val="left"/>
+      <w:pPr>
+        <w:tabs>
+          <w:tab w:val="num" w:pos="720"/>
+        </w:tabs>
+        <w:ind w:left="720" w:hanging="360"/>
+      </w:pPr>
+      <w:rPr>
+        <w:rFonts w:ascii="Symbol" w:hAnsi="Symbol" w:hint="default"/>
+        <w:sz w:val="20"/>
+      </w:rPr>
+    </w:lvl>
+    <w:lvl w:ilvl="1" w:tentative="1">
+      <w:start w:val="1"/>
+      <w:numFmt w:val="bullet"/>
+      <w:lvlText w:val="o"/>
+      <w:lvlJc w:val="left"/>
+      <w:pPr>
+        <w:tabs>
+          <w:tab w:val="num" w:pos="1440"/>
+        </w:tabs>
+        <w:ind w:left="1440" w:hanging="360"/>
+      </w:pPr>
+      <w:rPr>
+        <w:rFonts w:ascii="Courier New" w:hAnsi="Courier New" w:hint="default"/>
+        <w:sz w:val="20"/>
+      </w:rPr>
+    </w:lvl>
+    <w:lvl w:ilvl="2" w:tentative="1">
+      <w:start w:val="1"/>
+      <w:numFmt w:val="bullet"/>
+      <w:lvlText w:val=""/>
+      <w:lvlJc w:val="left"/>
+      <w:pPr>
+        <w:tabs>
+          <w:tab w:val="num" w:pos="2160"/>
+        </w:tabs>
+        <w:ind w:left="2160" w:hanging="360"/>
+      </w:pPr>
+      <w:rPr>
+        <w:rFonts w:ascii="Wingdings" w:hAnsi="Wingdings" w:hint="default"/>
+        <w:sz w:val="20"/>
+      </w:rPr>
+    </w:lvl>
+    <w:lvl w:ilvl="3" w:tentative="1">
+      <w:start w:val="1"/>
+      <w:numFmt w:val="bullet"/>
+      <w:lvlText w:val=""/>
+      <w:lvlJc w:val="left"/>
+      <w:pPr>
+        <w:tabs>
+          <w:tab w:val="num" w:pos="2880"/>
+        </w:tabs>
+        <w:ind w:left="2880" w:hanging="360"/>
+      </w:pPr>
+      <w:rPr>
+        <w:rFonts w:ascii="Wingdings" w:hAnsi="Wingdings" w:hint="default"/>
+        <w:sz w:val="20"/>
+      </w:rPr>
+    </w:lvl>
+    <w:lvl w:ilvl="4" w:tentative="1">
+      <w:start w:val="1"/>
+      <w:numFmt w:val="bullet"/>
+      <w:lvlText w:val=""/>
+      <w:lvlJc w:val="left"/>
+      <w:pPr>
+        <w:tabs>
+          <w:tab w:val="num" w:pos="3600"/>
+        </w:tabs>
+        <w:ind w:left="3600" w:hanging="360"/>
+      </w:pPr>
+      <w:rPr>
+        <w:rFonts w:ascii="Wingdings" w:hAnsi="Wingdings" w:hint="default"/>
+        <w:sz w:val="20"/>
+      </w:rPr>
+    </w:lvl>
+    <w:lvl w:ilvl="5" w:tentative="1">
+      <w:start w:val="1"/>
+      <w:numFmt w:val="bullet"/>
+      <w:lvlText w:val=""/>
+      <w:lvlJc w:val="left"/>
+      <w:pPr>
+        <w:tabs>
+          <w:tab w:val="num" w:pos="4320"/>
+        </w:tabs>
+        <w:ind w:left="4320" w:hanging="360"/>
+      </w:pPr>
+      <w:rPr>
+        <w:rFonts w:ascii="Wingdings" w:hAnsi="Wingdings" w:hint="default"/>
+        <w:sz w:val="20"/>
+      </w:rPr>
+    </w:lvl>
+    <w:lvl w:ilvl="6" w:tentative="1">
+      <w:start w:val="1"/>
+      <w:numFmt w:val="bullet"/>
+      <w:lvlText w:val=""/>
+      <w:lvlJc w:val="left"/>
+      <w:pPr>
+        <w:tabs>
+          <w:tab w:val="num" w:pos="5040"/>
+        </w:tabs>
+        <w:ind w:left="5040" w:hanging="360"/>
+      </w:pPr>
+      <w:rPr>
+        <w:rFonts w:ascii="Wingdings" w:hAnsi="Wingdings" w:hint="default"/>
+        <w:sz w:val="20"/>
+      </w:rPr>
+    </w:lvl>
+    <w:lvl w:ilvl="7" w:tentative="1">
+      <w:start w:val="1"/>
+      <w:numFmt w:val="bullet"/>
+      <w:lvlText w:val=""/>
+      <w:lvlJc w:val="left"/>
+      <w:pPr>
+        <w:tabs>
+          <w:tab w:val="num" w:pos="5760"/>
+        </w:tabs>
+        <w:ind w:left="5760" w:hanging="360"/>
+      </w:pPr>
+      <w:rPr>
+        <w:rFonts w:ascii="Wingdings" w:hAnsi="Wingdings" w:hint="default"/>
+        <w:sz w:val="20"/>
+      </w:rPr>
+    </w:lvl>
+    <w:lvl w:ilvl="8" w:tentative="1">
+      <w:start w:val="1"/>
+      <w:numFmt w:val="bullet"/>
+      <w:lvlText w:val=""/>
+      <w:lvlJc w:val="left"/>
+      <w:pPr>
+        <w:tabs>
+          <w:tab w:val="num" w:pos="6480"/>
+        </w:tabs>
+        <w:ind w:left="6480" w:hanging="360"/>
+      </w:pPr>
+      <w:rPr>
+        <w:rFonts w:ascii="Wingdings" w:hAnsi="Wingdings" w:hint="default"/>
+        <w:sz w:val="20"/>
+      </w:rPr>
+    </w:lvl>
+  </w:abstractNum>
+  <w:abstractNum w:abstractNumId="10" w15:restartNumberingAfterBreak="0">
+    <w:nsid w:val="2B4B27D5"/>
+    <w:multiLevelType w:val="multilevel"/>
+    <w:tmpl w:val="96EA1794"/>
+    <w:lvl w:ilvl="0">
+      <w:start w:val="1"/>
+      <w:numFmt w:val="bullet"/>
+      <w:lvlText w:val=""/>
+      <w:lvlJc w:val="left"/>
+      <w:pPr>
+        <w:tabs>
+          <w:tab w:val="num" w:pos="720"/>
+        </w:tabs>
+        <w:ind w:left="720" w:hanging="360"/>
+      </w:pPr>
+      <w:rPr>
+        <w:rFonts w:ascii="Symbol" w:hAnsi="Symbol" w:hint="default"/>
+        <w:sz w:val="20"/>
+      </w:rPr>
+    </w:lvl>
+    <w:lvl w:ilvl="1" w:tentative="1">
+      <w:start w:val="1"/>
+      <w:numFmt w:val="bullet"/>
+      <w:lvlText w:val="o"/>
+      <w:lvlJc w:val="left"/>
+      <w:pPr>
+        <w:tabs>
+          <w:tab w:val="num" w:pos="1440"/>
+        </w:tabs>
+        <w:ind w:left="1440" w:hanging="360"/>
+      </w:pPr>
+      <w:rPr>
+        <w:rFonts w:ascii="Courier New" w:hAnsi="Courier New" w:hint="default"/>
+        <w:sz w:val="20"/>
+      </w:rPr>
+    </w:lvl>
+    <w:lvl w:ilvl="2" w:tentative="1">
+      <w:start w:val="1"/>
+      <w:numFmt w:val="bullet"/>
+      <w:lvlText w:val=""/>
+      <w:lvlJc w:val="left"/>
+      <w:pPr>
+        <w:tabs>
+          <w:tab w:val="num" w:pos="2160"/>
+        </w:tabs>
+        <w:ind w:left="2160" w:hanging="360"/>
+      </w:pPr>
+      <w:rPr>
+        <w:rFonts w:ascii="Wingdings" w:hAnsi="Wingdings" w:hint="default"/>
+        <w:sz w:val="20"/>
+      </w:rPr>
+    </w:lvl>
+    <w:lvl w:ilvl="3" w:tentative="1">
+      <w:start w:val="1"/>
+      <w:numFmt w:val="bullet"/>
+      <w:lvlText w:val=""/>
+      <w:lvlJc w:val="left"/>
+      <w:pPr>
+        <w:tabs>
+          <w:tab w:val="num" w:pos="2880"/>
+        </w:tabs>
+        <w:ind w:left="2880" w:hanging="360"/>
+      </w:pPr>
+      <w:rPr>
+        <w:rFonts w:ascii="Wingdings" w:hAnsi="Wingdings" w:hint="default"/>
+        <w:sz w:val="20"/>
+      </w:rPr>
+    </w:lvl>
+    <w:lvl w:ilvl="4" w:tentative="1">
+      <w:start w:val="1"/>
+      <w:numFmt w:val="bullet"/>
+      <w:lvlText w:val=""/>
+      <w:lvlJc w:val="left"/>
+      <w:pPr>
+        <w:tabs>
+          <w:tab w:val="num" w:pos="3600"/>
+        </w:tabs>
+        <w:ind w:left="3600" w:hanging="360"/>
+      </w:pPr>
+      <w:rPr>
+        <w:rFonts w:ascii="Wingdings" w:hAnsi="Wingdings" w:hint="default"/>
+        <w:sz w:val="20"/>
+      </w:rPr>
+    </w:lvl>
+    <w:lvl w:ilvl="5" w:tentative="1">
+      <w:start w:val="1"/>
+      <w:numFmt w:val="bullet"/>
+      <w:lvlText w:val=""/>
+      <w:lvlJc w:val="left"/>
+      <w:pPr>
+        <w:tabs>
+          <w:tab w:val="num" w:pos="4320"/>
+        </w:tabs>
+        <w:ind w:left="4320" w:hanging="360"/>
+      </w:pPr>
+      <w:rPr>
+        <w:rFonts w:ascii="Wingdings" w:hAnsi="Wingdings" w:hint="default"/>
+        <w:sz w:val="20"/>
+      </w:rPr>
+    </w:lvl>
+    <w:lvl w:ilvl="6" w:tentative="1">
+      <w:start w:val="1"/>
+      <w:numFmt w:val="bullet"/>
+      <w:lvlText w:val=""/>
+      <w:lvlJc w:val="left"/>
+      <w:pPr>
+        <w:tabs>
+          <w:tab w:val="num" w:pos="5040"/>
+        </w:tabs>
+        <w:ind w:left="5040" w:hanging="360"/>
+      </w:pPr>
+      <w:rPr>
+        <w:rFonts w:ascii="Wingdings" w:hAnsi="Wingdings" w:hint="default"/>
+        <w:sz w:val="20"/>
+      </w:rPr>
+    </w:lvl>
+    <w:lvl w:ilvl="7" w:tentative="1">
+      <w:start w:val="1"/>
+      <w:numFmt w:val="bullet"/>
+      <w:lvlText w:val=""/>
+      <w:lvlJc w:val="left"/>
+      <w:pPr>
+        <w:tabs>
+          <w:tab w:val="num" w:pos="5760"/>
+        </w:tabs>
+        <w:ind w:left="5760" w:hanging="360"/>
+      </w:pPr>
+      <w:rPr>
+        <w:rFonts w:ascii="Wingdings" w:hAnsi="Wingdings" w:hint="default"/>
+        <w:sz w:val="20"/>
+      </w:rPr>
+    </w:lvl>
+    <w:lvl w:ilvl="8" w:tentative="1">
+      <w:start w:val="1"/>
+      <w:numFmt w:val="bullet"/>
+      <w:lvlText w:val=""/>
+      <w:lvlJc w:val="left"/>
+      <w:pPr>
+        <w:tabs>
+          <w:tab w:val="num" w:pos="6480"/>
+        </w:tabs>
+        <w:ind w:left="6480" w:hanging="360"/>
+      </w:pPr>
+      <w:rPr>
+        <w:rFonts w:ascii="Wingdings" w:hAnsi="Wingdings" w:hint="default"/>
+        <w:sz w:val="20"/>
+      </w:rPr>
+    </w:lvl>
+  </w:abstractNum>
+  <w:abstractNum w:abstractNumId="11" w15:restartNumberingAfterBreak="0">
+    <w:nsid w:val="33771677"/>
+    <w:multiLevelType w:val="multilevel"/>
+    <w:tmpl w:val="35100CF8"/>
+    <w:lvl w:ilvl="0">
+      <w:start w:val="1"/>
+      <w:numFmt w:val="bullet"/>
+      <w:lvlText w:val=""/>
+      <w:lvlJc w:val="left"/>
+      <w:pPr>
+        <w:tabs>
+          <w:tab w:val="num" w:pos="720"/>
+        </w:tabs>
+        <w:ind w:left="720" w:hanging="360"/>
+      </w:pPr>
+      <w:rPr>
+        <w:rFonts w:ascii="Symbol" w:hAnsi="Symbol" w:hint="default"/>
+        <w:sz w:val="20"/>
+      </w:rPr>
+    </w:lvl>
+    <w:lvl w:ilvl="1" w:tentative="1">
+      <w:start w:val="1"/>
+      <w:numFmt w:val="bullet"/>
+      <w:lvlText w:val="o"/>
+      <w:lvlJc w:val="left"/>
+      <w:pPr>
+        <w:tabs>
+          <w:tab w:val="num" w:pos="1440"/>
+        </w:tabs>
+        <w:ind w:left="1440" w:hanging="360"/>
+      </w:pPr>
+      <w:rPr>
+        <w:rFonts w:ascii="Courier New" w:hAnsi="Courier New" w:hint="default"/>
+        <w:sz w:val="20"/>
+      </w:rPr>
+    </w:lvl>
+    <w:lvl w:ilvl="2" w:tentative="1">
+      <w:start w:val="1"/>
+      <w:numFmt w:val="bullet"/>
+      <w:lvlText w:val=""/>
+      <w:lvlJc w:val="left"/>
+      <w:pPr>
+        <w:tabs>
+          <w:tab w:val="num" w:pos="2160"/>
+        </w:tabs>
+        <w:ind w:left="2160" w:hanging="360"/>
+      </w:pPr>
+      <w:rPr>
+        <w:rFonts w:ascii="Wingdings" w:hAnsi="Wingdings" w:hint="default"/>
+        <w:sz w:val="20"/>
+      </w:rPr>
+    </w:lvl>
+    <w:lvl w:ilvl="3" w:tentative="1">
+      <w:start w:val="1"/>
+      <w:numFmt w:val="bullet"/>
+      <w:lvlText w:val=""/>
+      <w:lvlJc w:val="left"/>
+      <w:pPr>
+        <w:tabs>
+          <w:tab w:val="num" w:pos="2880"/>
+        </w:tabs>
+        <w:ind w:left="2880" w:hanging="360"/>
+      </w:pPr>
+      <w:rPr>
+        <w:rFonts w:ascii="Wingdings" w:hAnsi="Wingdings" w:hint="default"/>
+        <w:sz w:val="20"/>
+      </w:rPr>
+    </w:lvl>
+    <w:lvl w:ilvl="4" w:tentative="1">
+      <w:start w:val="1"/>
+      <w:numFmt w:val="bullet"/>
+      <w:lvlText w:val=""/>
+      <w:lvlJc w:val="left"/>
+      <w:pPr>
+        <w:tabs>
+          <w:tab w:val="num" w:pos="3600"/>
+        </w:tabs>
+        <w:ind w:left="3600" w:hanging="360"/>
+      </w:pPr>
+      <w:rPr>
+        <w:rFonts w:ascii="Wingdings" w:hAnsi="Wingdings" w:hint="default"/>
+        <w:sz w:val="20"/>
+      </w:rPr>
+    </w:lvl>
+    <w:lvl w:ilvl="5" w:tentative="1">
+      <w:start w:val="1"/>
+      <w:numFmt w:val="bullet"/>
+      <w:lvlText w:val=""/>
+      <w:lvlJc w:val="left"/>
+      <w:pPr>
+        <w:tabs>
+          <w:tab w:val="num" w:pos="4320"/>
+        </w:tabs>
+        <w:ind w:left="4320" w:hanging="360"/>
+      </w:pPr>
+      <w:rPr>
+        <w:rFonts w:ascii="Wingdings" w:hAnsi="Wingdings" w:hint="default"/>
+        <w:sz w:val="20"/>
+      </w:rPr>
+    </w:lvl>
+    <w:lvl w:ilvl="6" w:tentative="1">
+      <w:start w:val="1"/>
+      <w:numFmt w:val="bullet"/>
+      <w:lvlText w:val=""/>
+      <w:lvlJc w:val="left"/>
+      <w:pPr>
+        <w:tabs>
+          <w:tab w:val="num" w:pos="5040"/>
+        </w:tabs>
+        <w:ind w:left="5040" w:hanging="360"/>
+      </w:pPr>
+      <w:rPr>
+        <w:rFonts w:ascii="Wingdings" w:hAnsi="Wingdings" w:hint="default"/>
+        <w:sz w:val="20"/>
+      </w:rPr>
+    </w:lvl>
+    <w:lvl w:ilvl="7" w:tentative="1">
+      <w:start w:val="1"/>
+      <w:numFmt w:val="bullet"/>
+      <w:lvlText w:val=""/>
+      <w:lvlJc w:val="left"/>
+      <w:pPr>
+        <w:tabs>
+          <w:tab w:val="num" w:pos="5760"/>
+        </w:tabs>
+        <w:ind w:left="5760" w:hanging="360"/>
+      </w:pPr>
+      <w:rPr>
+        <w:rFonts w:ascii="Wingdings" w:hAnsi="Wingdings" w:hint="default"/>
+        <w:sz w:val="20"/>
+      </w:rPr>
+    </w:lvl>
+    <w:lvl w:ilvl="8" w:tentative="1">
+      <w:start w:val="1"/>
+      <w:numFmt w:val="bullet"/>
+      <w:lvlText w:val=""/>
+      <w:lvlJc w:val="left"/>
+      <w:pPr>
+        <w:tabs>
+          <w:tab w:val="num" w:pos="6480"/>
+        </w:tabs>
+        <w:ind w:left="6480" w:hanging="360"/>
+      </w:pPr>
+      <w:rPr>
+        <w:rFonts w:ascii="Wingdings" w:hAnsi="Wingdings" w:hint="default"/>
+        <w:sz w:val="20"/>
+      </w:rPr>
+    </w:lvl>
+  </w:abstractNum>
+  <w:abstractNum w:abstractNumId="12" w15:restartNumberingAfterBreak="0">
     <w:nsid w:val="3FE74193"/>
     <w:multiLevelType w:val="multilevel"/>
     <w:tmpl w:val="DD10385E"/>
@@ -11284,7 +14315,7 @@
       </w:rPr>
     </w:lvl>
   </w:abstractNum>
-  <w:abstractNum w:abstractNumId="7" w15:restartNumberingAfterBreak="0">
+  <w:abstractNum w:abstractNumId="13" w15:restartNumberingAfterBreak="0">
     <w:nsid w:val="44593DBD"/>
     <w:multiLevelType w:val="multilevel"/>
     <w:tmpl w:val="646C097C"/>
@@ -11433,7 +14464,7 @@
       </w:rPr>
     </w:lvl>
   </w:abstractNum>
-  <w:abstractNum w:abstractNumId="8" w15:restartNumberingAfterBreak="0">
+  <w:abstractNum w:abstractNumId="14" w15:restartNumberingAfterBreak="0">
     <w:nsid w:val="496E4256"/>
     <w:multiLevelType w:val="multilevel"/>
     <w:tmpl w:val="509A73F6"/>
@@ -11582,7 +14613,156 @@
       </w:rPr>
     </w:lvl>
   </w:abstractNum>
-  <w:abstractNum w:abstractNumId="9" w15:restartNumberingAfterBreak="0">
+  <w:abstractNum w:abstractNumId="15" w15:restartNumberingAfterBreak="0">
+    <w:nsid w:val="4E2B0ED8"/>
+    <w:multiLevelType w:val="multilevel"/>
+    <w:tmpl w:val="5C12892E"/>
+    <w:lvl w:ilvl="0">
+      <w:start w:val="1"/>
+      <w:numFmt w:val="bullet"/>
+      <w:lvlText w:val=""/>
+      <w:lvlJc w:val="left"/>
+      <w:pPr>
+        <w:tabs>
+          <w:tab w:val="num" w:pos="720"/>
+        </w:tabs>
+        <w:ind w:left="720" w:hanging="360"/>
+      </w:pPr>
+      <w:rPr>
+        <w:rFonts w:ascii="Symbol" w:hAnsi="Symbol" w:hint="default"/>
+        <w:sz w:val="20"/>
+      </w:rPr>
+    </w:lvl>
+    <w:lvl w:ilvl="1" w:tentative="1">
+      <w:start w:val="1"/>
+      <w:numFmt w:val="bullet"/>
+      <w:lvlText w:val="o"/>
+      <w:lvlJc w:val="left"/>
+      <w:pPr>
+        <w:tabs>
+          <w:tab w:val="num" w:pos="1440"/>
+        </w:tabs>
+        <w:ind w:left="1440" w:hanging="360"/>
+      </w:pPr>
+      <w:rPr>
+        <w:rFonts w:ascii="Courier New" w:hAnsi="Courier New" w:hint="default"/>
+        <w:sz w:val="20"/>
+      </w:rPr>
+    </w:lvl>
+    <w:lvl w:ilvl="2" w:tentative="1">
+      <w:start w:val="1"/>
+      <w:numFmt w:val="bullet"/>
+      <w:lvlText w:val=""/>
+      <w:lvlJc w:val="left"/>
+      <w:pPr>
+        <w:tabs>
+          <w:tab w:val="num" w:pos="2160"/>
+        </w:tabs>
+        <w:ind w:left="2160" w:hanging="360"/>
+      </w:pPr>
+      <w:rPr>
+        <w:rFonts w:ascii="Wingdings" w:hAnsi="Wingdings" w:hint="default"/>
+        <w:sz w:val="20"/>
+      </w:rPr>
+    </w:lvl>
+    <w:lvl w:ilvl="3" w:tentative="1">
+      <w:start w:val="1"/>
+      <w:numFmt w:val="bullet"/>
+      <w:lvlText w:val=""/>
+      <w:lvlJc w:val="left"/>
+      <w:pPr>
+        <w:tabs>
+          <w:tab w:val="num" w:pos="2880"/>
+        </w:tabs>
+        <w:ind w:left="2880" w:hanging="360"/>
+      </w:pPr>
+      <w:rPr>
+        <w:rFonts w:ascii="Wingdings" w:hAnsi="Wingdings" w:hint="default"/>
+        <w:sz w:val="20"/>
+      </w:rPr>
+    </w:lvl>
+    <w:lvl w:ilvl="4" w:tentative="1">
+      <w:start w:val="1"/>
+      <w:numFmt w:val="bullet"/>
+      <w:lvlText w:val=""/>
+      <w:lvlJc w:val="left"/>
+      <w:pPr>
+        <w:tabs>
+          <w:tab w:val="num" w:pos="3600"/>
+        </w:tabs>
+        <w:ind w:left="3600" w:hanging="360"/>
+      </w:pPr>
+      <w:rPr>
+        <w:rFonts w:ascii="Wingdings" w:hAnsi="Wingdings" w:hint="default"/>
+        <w:sz w:val="20"/>
+      </w:rPr>
+    </w:lvl>
+    <w:lvl w:ilvl="5" w:tentative="1">
+      <w:start w:val="1"/>
+      <w:numFmt w:val="bullet"/>
+      <w:lvlText w:val=""/>
+      <w:lvlJc w:val="left"/>
+      <w:pPr>
+        <w:tabs>
+          <w:tab w:val="num" w:pos="4320"/>
+        </w:tabs>
+        <w:ind w:left="4320" w:hanging="360"/>
+      </w:pPr>
+      <w:rPr>
+        <w:rFonts w:ascii="Wingdings" w:hAnsi="Wingdings" w:hint="default"/>
+        <w:sz w:val="20"/>
+      </w:rPr>
+    </w:lvl>
+    <w:lvl w:ilvl="6" w:tentative="1">
+      <w:start w:val="1"/>
+      <w:numFmt w:val="bullet"/>
+      <w:lvlText w:val=""/>
+      <w:lvlJc w:val="left"/>
+      <w:pPr>
+        <w:tabs>
+          <w:tab w:val="num" w:pos="5040"/>
+        </w:tabs>
+        <w:ind w:left="5040" w:hanging="360"/>
+      </w:pPr>
+      <w:rPr>
+        <w:rFonts w:ascii="Wingdings" w:hAnsi="Wingdings" w:hint="default"/>
+        <w:sz w:val="20"/>
+      </w:rPr>
+    </w:lvl>
+    <w:lvl w:ilvl="7" w:tentative="1">
+      <w:start w:val="1"/>
+      <w:numFmt w:val="bullet"/>
+      <w:lvlText w:val=""/>
+      <w:lvlJc w:val="left"/>
+      <w:pPr>
+        <w:tabs>
+          <w:tab w:val="num" w:pos="5760"/>
+        </w:tabs>
+        <w:ind w:left="5760" w:hanging="360"/>
+      </w:pPr>
+      <w:rPr>
+        <w:rFonts w:ascii="Wingdings" w:hAnsi="Wingdings" w:hint="default"/>
+        <w:sz w:val="20"/>
+      </w:rPr>
+    </w:lvl>
+    <w:lvl w:ilvl="8" w:tentative="1">
+      <w:start w:val="1"/>
+      <w:numFmt w:val="bullet"/>
+      <w:lvlText w:val=""/>
+      <w:lvlJc w:val="left"/>
+      <w:pPr>
+        <w:tabs>
+          <w:tab w:val="num" w:pos="6480"/>
+        </w:tabs>
+        <w:ind w:left="6480" w:hanging="360"/>
+      </w:pPr>
+      <w:rPr>
+        <w:rFonts w:ascii="Wingdings" w:hAnsi="Wingdings" w:hint="default"/>
+        <w:sz w:val="20"/>
+      </w:rPr>
+    </w:lvl>
+  </w:abstractNum>
+  <w:abstractNum w:abstractNumId="16" w15:restartNumberingAfterBreak="0">
     <w:nsid w:val="4F472230"/>
     <w:multiLevelType w:val="multilevel"/>
     <w:tmpl w:val="6D4EACE4"/>
@@ -11731,7 +14911,156 @@
       </w:rPr>
     </w:lvl>
   </w:abstractNum>
-  <w:abstractNum w:abstractNumId="10" w15:restartNumberingAfterBreak="0">
+  <w:abstractNum w:abstractNumId="17" w15:restartNumberingAfterBreak="0">
+    <w:nsid w:val="4F8038E1"/>
+    <w:multiLevelType w:val="multilevel"/>
+    <w:tmpl w:val="9E661B16"/>
+    <w:lvl w:ilvl="0">
+      <w:start w:val="1"/>
+      <w:numFmt w:val="bullet"/>
+      <w:lvlText w:val=""/>
+      <w:lvlJc w:val="left"/>
+      <w:pPr>
+        <w:tabs>
+          <w:tab w:val="num" w:pos="720"/>
+        </w:tabs>
+        <w:ind w:left="720" w:hanging="360"/>
+      </w:pPr>
+      <w:rPr>
+        <w:rFonts w:ascii="Symbol" w:hAnsi="Symbol" w:hint="default"/>
+        <w:sz w:val="20"/>
+      </w:rPr>
+    </w:lvl>
+    <w:lvl w:ilvl="1" w:tentative="1">
+      <w:start w:val="1"/>
+      <w:numFmt w:val="bullet"/>
+      <w:lvlText w:val="o"/>
+      <w:lvlJc w:val="left"/>
+      <w:pPr>
+        <w:tabs>
+          <w:tab w:val="num" w:pos="1440"/>
+        </w:tabs>
+        <w:ind w:left="1440" w:hanging="360"/>
+      </w:pPr>
+      <w:rPr>
+        <w:rFonts w:ascii="Courier New" w:hAnsi="Courier New" w:hint="default"/>
+        <w:sz w:val="20"/>
+      </w:rPr>
+    </w:lvl>
+    <w:lvl w:ilvl="2" w:tentative="1">
+      <w:start w:val="1"/>
+      <w:numFmt w:val="bullet"/>
+      <w:lvlText w:val=""/>
+      <w:lvlJc w:val="left"/>
+      <w:pPr>
+        <w:tabs>
+          <w:tab w:val="num" w:pos="2160"/>
+        </w:tabs>
+        <w:ind w:left="2160" w:hanging="360"/>
+      </w:pPr>
+      <w:rPr>
+        <w:rFonts w:ascii="Wingdings" w:hAnsi="Wingdings" w:hint="default"/>
+        <w:sz w:val="20"/>
+      </w:rPr>
+    </w:lvl>
+    <w:lvl w:ilvl="3" w:tentative="1">
+      <w:start w:val="1"/>
+      <w:numFmt w:val="bullet"/>
+      <w:lvlText w:val=""/>
+      <w:lvlJc w:val="left"/>
+      <w:pPr>
+        <w:tabs>
+          <w:tab w:val="num" w:pos="2880"/>
+        </w:tabs>
+        <w:ind w:left="2880" w:hanging="360"/>
+      </w:pPr>
+      <w:rPr>
+        <w:rFonts w:ascii="Wingdings" w:hAnsi="Wingdings" w:hint="default"/>
+        <w:sz w:val="20"/>
+      </w:rPr>
+    </w:lvl>
+    <w:lvl w:ilvl="4" w:tentative="1">
+      <w:start w:val="1"/>
+      <w:numFmt w:val="bullet"/>
+      <w:lvlText w:val=""/>
+      <w:lvlJc w:val="left"/>
+      <w:pPr>
+        <w:tabs>
+          <w:tab w:val="num" w:pos="3600"/>
+        </w:tabs>
+        <w:ind w:left="3600" w:hanging="360"/>
+      </w:pPr>
+      <w:rPr>
+        <w:rFonts w:ascii="Wingdings" w:hAnsi="Wingdings" w:hint="default"/>
+        <w:sz w:val="20"/>
+      </w:rPr>
+    </w:lvl>
+    <w:lvl w:ilvl="5" w:tentative="1">
+      <w:start w:val="1"/>
+      <w:numFmt w:val="bullet"/>
+      <w:lvlText w:val=""/>
+      <w:lvlJc w:val="left"/>
+      <w:pPr>
+        <w:tabs>
+          <w:tab w:val="num" w:pos="4320"/>
+        </w:tabs>
+        <w:ind w:left="4320" w:hanging="360"/>
+      </w:pPr>
+      <w:rPr>
+        <w:rFonts w:ascii="Wingdings" w:hAnsi="Wingdings" w:hint="default"/>
+        <w:sz w:val="20"/>
+      </w:rPr>
+    </w:lvl>
+    <w:lvl w:ilvl="6" w:tentative="1">
+      <w:start w:val="1"/>
+      <w:numFmt w:val="bullet"/>
+      <w:lvlText w:val=""/>
+      <w:lvlJc w:val="left"/>
+      <w:pPr>
+        <w:tabs>
+          <w:tab w:val="num" w:pos="5040"/>
+        </w:tabs>
+        <w:ind w:left="5040" w:hanging="360"/>
+      </w:pPr>
+      <w:rPr>
+        <w:rFonts w:ascii="Wingdings" w:hAnsi="Wingdings" w:hint="default"/>
+        <w:sz w:val="20"/>
+      </w:rPr>
+    </w:lvl>
+    <w:lvl w:ilvl="7" w:tentative="1">
+      <w:start w:val="1"/>
+      <w:numFmt w:val="bullet"/>
+      <w:lvlText w:val=""/>
+      <w:lvlJc w:val="left"/>
+      <w:pPr>
+        <w:tabs>
+          <w:tab w:val="num" w:pos="5760"/>
+        </w:tabs>
+        <w:ind w:left="5760" w:hanging="360"/>
+      </w:pPr>
+      <w:rPr>
+        <w:rFonts w:ascii="Wingdings" w:hAnsi="Wingdings" w:hint="default"/>
+        <w:sz w:val="20"/>
+      </w:rPr>
+    </w:lvl>
+    <w:lvl w:ilvl="8" w:tentative="1">
+      <w:start w:val="1"/>
+      <w:numFmt w:val="bullet"/>
+      <w:lvlText w:val=""/>
+      <w:lvlJc w:val="left"/>
+      <w:pPr>
+        <w:tabs>
+          <w:tab w:val="num" w:pos="6480"/>
+        </w:tabs>
+        <w:ind w:left="6480" w:hanging="360"/>
+      </w:pPr>
+      <w:rPr>
+        <w:rFonts w:ascii="Wingdings" w:hAnsi="Wingdings" w:hint="default"/>
+        <w:sz w:val="20"/>
+      </w:rPr>
+    </w:lvl>
+  </w:abstractNum>
+  <w:abstractNum w:abstractNumId="18" w15:restartNumberingAfterBreak="0">
     <w:nsid w:val="505814D6"/>
     <w:multiLevelType w:val="multilevel"/>
     <w:tmpl w:val="F4AAA864"/>
@@ -11880,7 +15209,7 @@
       </w:rPr>
     </w:lvl>
   </w:abstractNum>
-  <w:abstractNum w:abstractNumId="11" w15:restartNumberingAfterBreak="0">
+  <w:abstractNum w:abstractNumId="19" w15:restartNumberingAfterBreak="0">
     <w:nsid w:val="55281CCF"/>
     <w:multiLevelType w:val="multilevel"/>
     <w:tmpl w:val="F0882474"/>
@@ -12029,7 +15358,305 @@
       </w:rPr>
     </w:lvl>
   </w:abstractNum>
-  <w:abstractNum w:abstractNumId="12" w15:restartNumberingAfterBreak="0">
+  <w:abstractNum w:abstractNumId="20" w15:restartNumberingAfterBreak="0">
+    <w:nsid w:val="5597517C"/>
+    <w:multiLevelType w:val="multilevel"/>
+    <w:tmpl w:val="B4AA83EC"/>
+    <w:lvl w:ilvl="0">
+      <w:start w:val="1"/>
+      <w:numFmt w:val="bullet"/>
+      <w:lvlText w:val=""/>
+      <w:lvlJc w:val="left"/>
+      <w:pPr>
+        <w:tabs>
+          <w:tab w:val="num" w:pos="720"/>
+        </w:tabs>
+        <w:ind w:left="720" w:hanging="360"/>
+      </w:pPr>
+      <w:rPr>
+        <w:rFonts w:ascii="Symbol" w:hAnsi="Symbol" w:hint="default"/>
+        <w:sz w:val="20"/>
+      </w:rPr>
+    </w:lvl>
+    <w:lvl w:ilvl="1" w:tentative="1">
+      <w:start w:val="1"/>
+      <w:numFmt w:val="bullet"/>
+      <w:lvlText w:val="o"/>
+      <w:lvlJc w:val="left"/>
+      <w:pPr>
+        <w:tabs>
+          <w:tab w:val="num" w:pos="1440"/>
+        </w:tabs>
+        <w:ind w:left="1440" w:hanging="360"/>
+      </w:pPr>
+      <w:rPr>
+        <w:rFonts w:ascii="Courier New" w:hAnsi="Courier New" w:hint="default"/>
+        <w:sz w:val="20"/>
+      </w:rPr>
+    </w:lvl>
+    <w:lvl w:ilvl="2" w:tentative="1">
+      <w:start w:val="1"/>
+      <w:numFmt w:val="bullet"/>
+      <w:lvlText w:val=""/>
+      <w:lvlJc w:val="left"/>
+      <w:pPr>
+        <w:tabs>
+          <w:tab w:val="num" w:pos="2160"/>
+        </w:tabs>
+        <w:ind w:left="2160" w:hanging="360"/>
+      </w:pPr>
+      <w:rPr>
+        <w:rFonts w:ascii="Wingdings" w:hAnsi="Wingdings" w:hint="default"/>
+        <w:sz w:val="20"/>
+      </w:rPr>
+    </w:lvl>
+    <w:lvl w:ilvl="3" w:tentative="1">
+      <w:start w:val="1"/>
+      <w:numFmt w:val="bullet"/>
+      <w:lvlText w:val=""/>
+      <w:lvlJc w:val="left"/>
+      <w:pPr>
+        <w:tabs>
+          <w:tab w:val="num" w:pos="2880"/>
+        </w:tabs>
+        <w:ind w:left="2880" w:hanging="360"/>
+      </w:pPr>
+      <w:rPr>
+        <w:rFonts w:ascii="Wingdings" w:hAnsi="Wingdings" w:hint="default"/>
+        <w:sz w:val="20"/>
+      </w:rPr>
+    </w:lvl>
+    <w:lvl w:ilvl="4" w:tentative="1">
+      <w:start w:val="1"/>
+      <w:numFmt w:val="bullet"/>
+      <w:lvlText w:val=""/>
+      <w:lvlJc w:val="left"/>
+      <w:pPr>
+        <w:tabs>
+          <w:tab w:val="num" w:pos="3600"/>
+        </w:tabs>
+        <w:ind w:left="3600" w:hanging="360"/>
+      </w:pPr>
+      <w:rPr>
+        <w:rFonts w:ascii="Wingdings" w:hAnsi="Wingdings" w:hint="default"/>
+        <w:sz w:val="20"/>
+      </w:rPr>
+    </w:lvl>
+    <w:lvl w:ilvl="5" w:tentative="1">
+      <w:start w:val="1"/>
+      <w:numFmt w:val="bullet"/>
+      <w:lvlText w:val=""/>
+      <w:lvlJc w:val="left"/>
+      <w:pPr>
+        <w:tabs>
+          <w:tab w:val="num" w:pos="4320"/>
+        </w:tabs>
+        <w:ind w:left="4320" w:hanging="360"/>
+      </w:pPr>
+      <w:rPr>
+        <w:rFonts w:ascii="Wingdings" w:hAnsi="Wingdings" w:hint="default"/>
+        <w:sz w:val="20"/>
+      </w:rPr>
+    </w:lvl>
+    <w:lvl w:ilvl="6" w:tentative="1">
+      <w:start w:val="1"/>
+      <w:numFmt w:val="bullet"/>
+      <w:lvlText w:val=""/>
+      <w:lvlJc w:val="left"/>
+      <w:pPr>
+        <w:tabs>
+          <w:tab w:val="num" w:pos="5040"/>
+        </w:tabs>
+        <w:ind w:left="5040" w:hanging="360"/>
+      </w:pPr>
+      <w:rPr>
+        <w:rFonts w:ascii="Wingdings" w:hAnsi="Wingdings" w:hint="default"/>
+        <w:sz w:val="20"/>
+      </w:rPr>
+    </w:lvl>
+    <w:lvl w:ilvl="7" w:tentative="1">
+      <w:start w:val="1"/>
+      <w:numFmt w:val="bullet"/>
+      <w:lvlText w:val=""/>
+      <w:lvlJc w:val="left"/>
+      <w:pPr>
+        <w:tabs>
+          <w:tab w:val="num" w:pos="5760"/>
+        </w:tabs>
+        <w:ind w:left="5760" w:hanging="360"/>
+      </w:pPr>
+      <w:rPr>
+        <w:rFonts w:ascii="Wingdings" w:hAnsi="Wingdings" w:hint="default"/>
+        <w:sz w:val="20"/>
+      </w:rPr>
+    </w:lvl>
+    <w:lvl w:ilvl="8" w:tentative="1">
+      <w:start w:val="1"/>
+      <w:numFmt w:val="bullet"/>
+      <w:lvlText w:val=""/>
+      <w:lvlJc w:val="left"/>
+      <w:pPr>
+        <w:tabs>
+          <w:tab w:val="num" w:pos="6480"/>
+        </w:tabs>
+        <w:ind w:left="6480" w:hanging="360"/>
+      </w:pPr>
+      <w:rPr>
+        <w:rFonts w:ascii="Wingdings" w:hAnsi="Wingdings" w:hint="default"/>
+        <w:sz w:val="20"/>
+      </w:rPr>
+    </w:lvl>
+  </w:abstractNum>
+  <w:abstractNum w:abstractNumId="21" w15:restartNumberingAfterBreak="0">
+    <w:nsid w:val="5A204B25"/>
+    <w:multiLevelType w:val="multilevel"/>
+    <w:tmpl w:val="394473D6"/>
+    <w:lvl w:ilvl="0">
+      <w:start w:val="1"/>
+      <w:numFmt w:val="bullet"/>
+      <w:lvlText w:val=""/>
+      <w:lvlJc w:val="left"/>
+      <w:pPr>
+        <w:tabs>
+          <w:tab w:val="num" w:pos="720"/>
+        </w:tabs>
+        <w:ind w:left="720" w:hanging="360"/>
+      </w:pPr>
+      <w:rPr>
+        <w:rFonts w:ascii="Symbol" w:hAnsi="Symbol" w:hint="default"/>
+        <w:sz w:val="20"/>
+      </w:rPr>
+    </w:lvl>
+    <w:lvl w:ilvl="1" w:tentative="1">
+      <w:start w:val="1"/>
+      <w:numFmt w:val="bullet"/>
+      <w:lvlText w:val="o"/>
+      <w:lvlJc w:val="left"/>
+      <w:pPr>
+        <w:tabs>
+          <w:tab w:val="num" w:pos="1440"/>
+        </w:tabs>
+        <w:ind w:left="1440" w:hanging="360"/>
+      </w:pPr>
+      <w:rPr>
+        <w:rFonts w:ascii="Courier New" w:hAnsi="Courier New" w:hint="default"/>
+        <w:sz w:val="20"/>
+      </w:rPr>
+    </w:lvl>
+    <w:lvl w:ilvl="2" w:tentative="1">
+      <w:start w:val="1"/>
+      <w:numFmt w:val="bullet"/>
+      <w:lvlText w:val=""/>
+      <w:lvlJc w:val="left"/>
+      <w:pPr>
+        <w:tabs>
+          <w:tab w:val="num" w:pos="2160"/>
+        </w:tabs>
+        <w:ind w:left="2160" w:hanging="360"/>
+      </w:pPr>
+      <w:rPr>
+        <w:rFonts w:ascii="Wingdings" w:hAnsi="Wingdings" w:hint="default"/>
+        <w:sz w:val="20"/>
+      </w:rPr>
+    </w:lvl>
+    <w:lvl w:ilvl="3" w:tentative="1">
+      <w:start w:val="1"/>
+      <w:numFmt w:val="bullet"/>
+      <w:lvlText w:val=""/>
+      <w:lvlJc w:val="left"/>
+      <w:pPr>
+        <w:tabs>
+          <w:tab w:val="num" w:pos="2880"/>
+        </w:tabs>
+        <w:ind w:left="2880" w:hanging="360"/>
+      </w:pPr>
+      <w:rPr>
+        <w:rFonts w:ascii="Wingdings" w:hAnsi="Wingdings" w:hint="default"/>
+        <w:sz w:val="20"/>
+      </w:rPr>
+    </w:lvl>
+    <w:lvl w:ilvl="4" w:tentative="1">
+      <w:start w:val="1"/>
+      <w:numFmt w:val="bullet"/>
+      <w:lvlText w:val=""/>
+      <w:lvlJc w:val="left"/>
+      <w:pPr>
+        <w:tabs>
+          <w:tab w:val="num" w:pos="3600"/>
+        </w:tabs>
+        <w:ind w:left="3600" w:hanging="360"/>
+      </w:pPr>
+      <w:rPr>
+        <w:rFonts w:ascii="Wingdings" w:hAnsi="Wingdings" w:hint="default"/>
+        <w:sz w:val="20"/>
+      </w:rPr>
+    </w:lvl>
+    <w:lvl w:ilvl="5" w:tentative="1">
+      <w:start w:val="1"/>
+      <w:numFmt w:val="bullet"/>
+      <w:lvlText w:val=""/>
+      <w:lvlJc w:val="left"/>
+      <w:pPr>
+        <w:tabs>
+          <w:tab w:val="num" w:pos="4320"/>
+        </w:tabs>
+        <w:ind w:left="4320" w:hanging="360"/>
+      </w:pPr>
+      <w:rPr>
+        <w:rFonts w:ascii="Wingdings" w:hAnsi="Wingdings" w:hint="default"/>
+        <w:sz w:val="20"/>
+      </w:rPr>
+    </w:lvl>
+    <w:lvl w:ilvl="6" w:tentative="1">
+      <w:start w:val="1"/>
+      <w:numFmt w:val="bullet"/>
+      <w:lvlText w:val=""/>
+      <w:lvlJc w:val="left"/>
+      <w:pPr>
+        <w:tabs>
+          <w:tab w:val="num" w:pos="5040"/>
+        </w:tabs>
+        <w:ind w:left="5040" w:hanging="360"/>
+      </w:pPr>
+      <w:rPr>
+        <w:rFonts w:ascii="Wingdings" w:hAnsi="Wingdings" w:hint="default"/>
+        <w:sz w:val="20"/>
+      </w:rPr>
+    </w:lvl>
+    <w:lvl w:ilvl="7" w:tentative="1">
+      <w:start w:val="1"/>
+      <w:numFmt w:val="bullet"/>
+      <w:lvlText w:val=""/>
+      <w:lvlJc w:val="left"/>
+      <w:pPr>
+        <w:tabs>
+          <w:tab w:val="num" w:pos="5760"/>
+        </w:tabs>
+        <w:ind w:left="5760" w:hanging="360"/>
+      </w:pPr>
+      <w:rPr>
+        <w:rFonts w:ascii="Wingdings" w:hAnsi="Wingdings" w:hint="default"/>
+        <w:sz w:val="20"/>
+      </w:rPr>
+    </w:lvl>
+    <w:lvl w:ilvl="8" w:tentative="1">
+      <w:start w:val="1"/>
+      <w:numFmt w:val="bullet"/>
+      <w:lvlText w:val=""/>
+      <w:lvlJc w:val="left"/>
+      <w:pPr>
+        <w:tabs>
+          <w:tab w:val="num" w:pos="6480"/>
+        </w:tabs>
+        <w:ind w:left="6480" w:hanging="360"/>
+      </w:pPr>
+      <w:rPr>
+        <w:rFonts w:ascii="Wingdings" w:hAnsi="Wingdings" w:hint="default"/>
+        <w:sz w:val="20"/>
+      </w:rPr>
+    </w:lvl>
+  </w:abstractNum>
+  <w:abstractNum w:abstractNumId="22" w15:restartNumberingAfterBreak="0">
     <w:nsid w:val="5A37451E"/>
     <w:multiLevelType w:val="multilevel"/>
     <w:tmpl w:val="B094D242"/>
@@ -12178,7 +15805,7 @@
       </w:rPr>
     </w:lvl>
   </w:abstractNum>
-  <w:abstractNum w:abstractNumId="13" w15:restartNumberingAfterBreak="0">
+  <w:abstractNum w:abstractNumId="23" w15:restartNumberingAfterBreak="0">
     <w:nsid w:val="60BB304C"/>
     <w:multiLevelType w:val="multilevel"/>
     <w:tmpl w:val="1BB45148"/>
@@ -12327,7 +15954,7 @@
       </w:rPr>
     </w:lvl>
   </w:abstractNum>
-  <w:abstractNum w:abstractNumId="14" w15:restartNumberingAfterBreak="0">
+  <w:abstractNum w:abstractNumId="24" w15:restartNumberingAfterBreak="0">
     <w:nsid w:val="615833E9"/>
     <w:multiLevelType w:val="multilevel"/>
     <w:tmpl w:val="841A6066"/>
@@ -12476,7 +16103,7 @@
       </w:rPr>
     </w:lvl>
   </w:abstractNum>
-  <w:abstractNum w:abstractNumId="15" w15:restartNumberingAfterBreak="0">
+  <w:abstractNum w:abstractNumId="25" w15:restartNumberingAfterBreak="0">
     <w:nsid w:val="620A6720"/>
     <w:multiLevelType w:val="multilevel"/>
     <w:tmpl w:val="210C3000"/>
@@ -12625,7 +16252,7 @@
       </w:rPr>
     </w:lvl>
   </w:abstractNum>
-  <w:abstractNum w:abstractNumId="16" w15:restartNumberingAfterBreak="0">
+  <w:abstractNum w:abstractNumId="26" w15:restartNumberingAfterBreak="0">
     <w:nsid w:val="63190A92"/>
     <w:multiLevelType w:val="multilevel"/>
     <w:tmpl w:val="5926672E"/>
@@ -12774,7 +16401,7 @@
       </w:rPr>
     </w:lvl>
   </w:abstractNum>
-  <w:abstractNum w:abstractNumId="17" w15:restartNumberingAfterBreak="0">
+  <w:abstractNum w:abstractNumId="27" w15:restartNumberingAfterBreak="0">
     <w:nsid w:val="64C3594C"/>
     <w:multiLevelType w:val="multilevel"/>
     <w:tmpl w:val="0F9E7D12"/>
@@ -12923,7 +16550,156 @@
       </w:rPr>
     </w:lvl>
   </w:abstractNum>
-  <w:abstractNum w:abstractNumId="18" w15:restartNumberingAfterBreak="0">
+  <w:abstractNum w:abstractNumId="28" w15:restartNumberingAfterBreak="0">
+    <w:nsid w:val="650009E1"/>
+    <w:multiLevelType w:val="multilevel"/>
+    <w:tmpl w:val="6B6EBE22"/>
+    <w:lvl w:ilvl="0">
+      <w:start w:val="1"/>
+      <w:numFmt w:val="bullet"/>
+      <w:lvlText w:val=""/>
+      <w:lvlJc w:val="left"/>
+      <w:pPr>
+        <w:tabs>
+          <w:tab w:val="num" w:pos="720"/>
+        </w:tabs>
+        <w:ind w:left="720" w:hanging="360"/>
+      </w:pPr>
+      <w:rPr>
+        <w:rFonts w:ascii="Symbol" w:hAnsi="Symbol" w:hint="default"/>
+        <w:sz w:val="20"/>
+      </w:rPr>
+    </w:lvl>
+    <w:lvl w:ilvl="1" w:tentative="1">
+      <w:start w:val="1"/>
+      <w:numFmt w:val="bullet"/>
+      <w:lvlText w:val="o"/>
+      <w:lvlJc w:val="left"/>
+      <w:pPr>
+        <w:tabs>
+          <w:tab w:val="num" w:pos="1440"/>
+        </w:tabs>
+        <w:ind w:left="1440" w:hanging="360"/>
+      </w:pPr>
+      <w:rPr>
+        <w:rFonts w:ascii="Courier New" w:hAnsi="Courier New" w:hint="default"/>
+        <w:sz w:val="20"/>
+      </w:rPr>
+    </w:lvl>
+    <w:lvl w:ilvl="2" w:tentative="1">
+      <w:start w:val="1"/>
+      <w:numFmt w:val="bullet"/>
+      <w:lvlText w:val=""/>
+      <w:lvlJc w:val="left"/>
+      <w:pPr>
+        <w:tabs>
+          <w:tab w:val="num" w:pos="2160"/>
+        </w:tabs>
+        <w:ind w:left="2160" w:hanging="360"/>
+      </w:pPr>
+      <w:rPr>
+        <w:rFonts w:ascii="Wingdings" w:hAnsi="Wingdings" w:hint="default"/>
+        <w:sz w:val="20"/>
+      </w:rPr>
+    </w:lvl>
+    <w:lvl w:ilvl="3" w:tentative="1">
+      <w:start w:val="1"/>
+      <w:numFmt w:val="bullet"/>
+      <w:lvlText w:val=""/>
+      <w:lvlJc w:val="left"/>
+      <w:pPr>
+        <w:tabs>
+          <w:tab w:val="num" w:pos="2880"/>
+        </w:tabs>
+        <w:ind w:left="2880" w:hanging="360"/>
+      </w:pPr>
+      <w:rPr>
+        <w:rFonts w:ascii="Wingdings" w:hAnsi="Wingdings" w:hint="default"/>
+        <w:sz w:val="20"/>
+      </w:rPr>
+    </w:lvl>
+    <w:lvl w:ilvl="4" w:tentative="1">
+      <w:start w:val="1"/>
+      <w:numFmt w:val="bullet"/>
+      <w:lvlText w:val=""/>
+      <w:lvlJc w:val="left"/>
+      <w:pPr>
+        <w:tabs>
+          <w:tab w:val="num" w:pos="3600"/>
+        </w:tabs>
+        <w:ind w:left="3600" w:hanging="360"/>
+      </w:pPr>
+      <w:rPr>
+        <w:rFonts w:ascii="Wingdings" w:hAnsi="Wingdings" w:hint="default"/>
+        <w:sz w:val="20"/>
+      </w:rPr>
+    </w:lvl>
+    <w:lvl w:ilvl="5" w:tentative="1">
+      <w:start w:val="1"/>
+      <w:numFmt w:val="bullet"/>
+      <w:lvlText w:val=""/>
+      <w:lvlJc w:val="left"/>
+      <w:pPr>
+        <w:tabs>
+          <w:tab w:val="num" w:pos="4320"/>
+        </w:tabs>
+        <w:ind w:left="4320" w:hanging="360"/>
+      </w:pPr>
+      <w:rPr>
+        <w:rFonts w:ascii="Wingdings" w:hAnsi="Wingdings" w:hint="default"/>
+        <w:sz w:val="20"/>
+      </w:rPr>
+    </w:lvl>
+    <w:lvl w:ilvl="6" w:tentative="1">
+      <w:start w:val="1"/>
+      <w:numFmt w:val="bullet"/>
+      <w:lvlText w:val=""/>
+      <w:lvlJc w:val="left"/>
+      <w:pPr>
+        <w:tabs>
+          <w:tab w:val="num" w:pos="5040"/>
+        </w:tabs>
+        <w:ind w:left="5040" w:hanging="360"/>
+      </w:pPr>
+      <w:rPr>
+        <w:rFonts w:ascii="Wingdings" w:hAnsi="Wingdings" w:hint="default"/>
+        <w:sz w:val="20"/>
+      </w:rPr>
+    </w:lvl>
+    <w:lvl w:ilvl="7" w:tentative="1">
+      <w:start w:val="1"/>
+      <w:numFmt w:val="bullet"/>
+      <w:lvlText w:val=""/>
+      <w:lvlJc w:val="left"/>
+      <w:pPr>
+        <w:tabs>
+          <w:tab w:val="num" w:pos="5760"/>
+        </w:tabs>
+        <w:ind w:left="5760" w:hanging="360"/>
+      </w:pPr>
+      <w:rPr>
+        <w:rFonts w:ascii="Wingdings" w:hAnsi="Wingdings" w:hint="default"/>
+        <w:sz w:val="20"/>
+      </w:rPr>
+    </w:lvl>
+    <w:lvl w:ilvl="8" w:tentative="1">
+      <w:start w:val="1"/>
+      <w:numFmt w:val="bullet"/>
+      <w:lvlText w:val=""/>
+      <w:lvlJc w:val="left"/>
+      <w:pPr>
+        <w:tabs>
+          <w:tab w:val="num" w:pos="6480"/>
+        </w:tabs>
+        <w:ind w:left="6480" w:hanging="360"/>
+      </w:pPr>
+      <w:rPr>
+        <w:rFonts w:ascii="Wingdings" w:hAnsi="Wingdings" w:hint="default"/>
+        <w:sz w:val="20"/>
+      </w:rPr>
+    </w:lvl>
+  </w:abstractNum>
+  <w:abstractNum w:abstractNumId="29" w15:restartNumberingAfterBreak="0">
     <w:nsid w:val="68AF5C86"/>
     <w:multiLevelType w:val="multilevel"/>
     <w:tmpl w:val="7C3EE1B6"/>
@@ -13072,7 +16848,305 @@
       </w:rPr>
     </w:lvl>
   </w:abstractNum>
-  <w:abstractNum w:abstractNumId="19" w15:restartNumberingAfterBreak="0">
+  <w:abstractNum w:abstractNumId="30" w15:restartNumberingAfterBreak="0">
+    <w:nsid w:val="6AFA380E"/>
+    <w:multiLevelType w:val="multilevel"/>
+    <w:tmpl w:val="8332B002"/>
+    <w:lvl w:ilvl="0">
+      <w:start w:val="1"/>
+      <w:numFmt w:val="bullet"/>
+      <w:lvlText w:val=""/>
+      <w:lvlJc w:val="left"/>
+      <w:pPr>
+        <w:tabs>
+          <w:tab w:val="num" w:pos="720"/>
+        </w:tabs>
+        <w:ind w:left="720" w:hanging="360"/>
+      </w:pPr>
+      <w:rPr>
+        <w:rFonts w:ascii="Symbol" w:hAnsi="Symbol" w:hint="default"/>
+        <w:sz w:val="20"/>
+      </w:rPr>
+    </w:lvl>
+    <w:lvl w:ilvl="1" w:tentative="1">
+      <w:start w:val="1"/>
+      <w:numFmt w:val="bullet"/>
+      <w:lvlText w:val="o"/>
+      <w:lvlJc w:val="left"/>
+      <w:pPr>
+        <w:tabs>
+          <w:tab w:val="num" w:pos="1440"/>
+        </w:tabs>
+        <w:ind w:left="1440" w:hanging="360"/>
+      </w:pPr>
+      <w:rPr>
+        <w:rFonts w:ascii="Courier New" w:hAnsi="Courier New" w:hint="default"/>
+        <w:sz w:val="20"/>
+      </w:rPr>
+    </w:lvl>
+    <w:lvl w:ilvl="2" w:tentative="1">
+      <w:start w:val="1"/>
+      <w:numFmt w:val="bullet"/>
+      <w:lvlText w:val=""/>
+      <w:lvlJc w:val="left"/>
+      <w:pPr>
+        <w:tabs>
+          <w:tab w:val="num" w:pos="2160"/>
+        </w:tabs>
+        <w:ind w:left="2160" w:hanging="360"/>
+      </w:pPr>
+      <w:rPr>
+        <w:rFonts w:ascii="Wingdings" w:hAnsi="Wingdings" w:hint="default"/>
+        <w:sz w:val="20"/>
+      </w:rPr>
+    </w:lvl>
+    <w:lvl w:ilvl="3" w:tentative="1">
+      <w:start w:val="1"/>
+      <w:numFmt w:val="bullet"/>
+      <w:lvlText w:val=""/>
+      <w:lvlJc w:val="left"/>
+      <w:pPr>
+        <w:tabs>
+          <w:tab w:val="num" w:pos="2880"/>
+        </w:tabs>
+        <w:ind w:left="2880" w:hanging="360"/>
+      </w:pPr>
+      <w:rPr>
+        <w:rFonts w:ascii="Wingdings" w:hAnsi="Wingdings" w:hint="default"/>
+        <w:sz w:val="20"/>
+      </w:rPr>
+    </w:lvl>
+    <w:lvl w:ilvl="4" w:tentative="1">
+      <w:start w:val="1"/>
+      <w:numFmt w:val="bullet"/>
+      <w:lvlText w:val=""/>
+      <w:lvlJc w:val="left"/>
+      <w:pPr>
+        <w:tabs>
+          <w:tab w:val="num" w:pos="3600"/>
+        </w:tabs>
+        <w:ind w:left="3600" w:hanging="360"/>
+      </w:pPr>
+      <w:rPr>
+        <w:rFonts w:ascii="Wingdings" w:hAnsi="Wingdings" w:hint="default"/>
+        <w:sz w:val="20"/>
+      </w:rPr>
+    </w:lvl>
+    <w:lvl w:ilvl="5" w:tentative="1">
+      <w:start w:val="1"/>
+      <w:numFmt w:val="bullet"/>
+      <w:lvlText w:val=""/>
+      <w:lvlJc w:val="left"/>
+      <w:pPr>
+        <w:tabs>
+          <w:tab w:val="num" w:pos="4320"/>
+        </w:tabs>
+        <w:ind w:left="4320" w:hanging="360"/>
+      </w:pPr>
+      <w:rPr>
+        <w:rFonts w:ascii="Wingdings" w:hAnsi="Wingdings" w:hint="default"/>
+        <w:sz w:val="20"/>
+      </w:rPr>
+    </w:lvl>
+    <w:lvl w:ilvl="6" w:tentative="1">
+      <w:start w:val="1"/>
+      <w:numFmt w:val="bullet"/>
+      <w:lvlText w:val=""/>
+      <w:lvlJc w:val="left"/>
+      <w:pPr>
+        <w:tabs>
+          <w:tab w:val="num" w:pos="5040"/>
+        </w:tabs>
+        <w:ind w:left="5040" w:hanging="360"/>
+      </w:pPr>
+      <w:rPr>
+        <w:rFonts w:ascii="Wingdings" w:hAnsi="Wingdings" w:hint="default"/>
+        <w:sz w:val="20"/>
+      </w:rPr>
+    </w:lvl>
+    <w:lvl w:ilvl="7" w:tentative="1">
+      <w:start w:val="1"/>
+      <w:numFmt w:val="bullet"/>
+      <w:lvlText w:val=""/>
+      <w:lvlJc w:val="left"/>
+      <w:pPr>
+        <w:tabs>
+          <w:tab w:val="num" w:pos="5760"/>
+        </w:tabs>
+        <w:ind w:left="5760" w:hanging="360"/>
+      </w:pPr>
+      <w:rPr>
+        <w:rFonts w:ascii="Wingdings" w:hAnsi="Wingdings" w:hint="default"/>
+        <w:sz w:val="20"/>
+      </w:rPr>
+    </w:lvl>
+    <w:lvl w:ilvl="8" w:tentative="1">
+      <w:start w:val="1"/>
+      <w:numFmt w:val="bullet"/>
+      <w:lvlText w:val=""/>
+      <w:lvlJc w:val="left"/>
+      <w:pPr>
+        <w:tabs>
+          <w:tab w:val="num" w:pos="6480"/>
+        </w:tabs>
+        <w:ind w:left="6480" w:hanging="360"/>
+      </w:pPr>
+      <w:rPr>
+        <w:rFonts w:ascii="Wingdings" w:hAnsi="Wingdings" w:hint="default"/>
+        <w:sz w:val="20"/>
+      </w:rPr>
+    </w:lvl>
+  </w:abstractNum>
+  <w:abstractNum w:abstractNumId="31" w15:restartNumberingAfterBreak="0">
+    <w:nsid w:val="6CB93993"/>
+    <w:multiLevelType w:val="multilevel"/>
+    <w:tmpl w:val="D81AE6B2"/>
+    <w:lvl w:ilvl="0">
+      <w:start w:val="1"/>
+      <w:numFmt w:val="bullet"/>
+      <w:lvlText w:val=""/>
+      <w:lvlJc w:val="left"/>
+      <w:pPr>
+        <w:tabs>
+          <w:tab w:val="num" w:pos="720"/>
+        </w:tabs>
+        <w:ind w:left="720" w:hanging="360"/>
+      </w:pPr>
+      <w:rPr>
+        <w:rFonts w:ascii="Symbol" w:hAnsi="Symbol" w:hint="default"/>
+        <w:sz w:val="20"/>
+      </w:rPr>
+    </w:lvl>
+    <w:lvl w:ilvl="1" w:tentative="1">
+      <w:start w:val="1"/>
+      <w:numFmt w:val="bullet"/>
+      <w:lvlText w:val="o"/>
+      <w:lvlJc w:val="left"/>
+      <w:pPr>
+        <w:tabs>
+          <w:tab w:val="num" w:pos="1440"/>
+        </w:tabs>
+        <w:ind w:left="1440" w:hanging="360"/>
+      </w:pPr>
+      <w:rPr>
+        <w:rFonts w:ascii="Courier New" w:hAnsi="Courier New" w:hint="default"/>
+        <w:sz w:val="20"/>
+      </w:rPr>
+    </w:lvl>
+    <w:lvl w:ilvl="2" w:tentative="1">
+      <w:start w:val="1"/>
+      <w:numFmt w:val="bullet"/>
+      <w:lvlText w:val=""/>
+      <w:lvlJc w:val="left"/>
+      <w:pPr>
+        <w:tabs>
+          <w:tab w:val="num" w:pos="2160"/>
+        </w:tabs>
+        <w:ind w:left="2160" w:hanging="360"/>
+      </w:pPr>
+      <w:rPr>
+        <w:rFonts w:ascii="Wingdings" w:hAnsi="Wingdings" w:hint="default"/>
+        <w:sz w:val="20"/>
+      </w:rPr>
+    </w:lvl>
+    <w:lvl w:ilvl="3" w:tentative="1">
+      <w:start w:val="1"/>
+      <w:numFmt w:val="bullet"/>
+      <w:lvlText w:val=""/>
+      <w:lvlJc w:val="left"/>
+      <w:pPr>
+        <w:tabs>
+          <w:tab w:val="num" w:pos="2880"/>
+        </w:tabs>
+        <w:ind w:left="2880" w:hanging="360"/>
+      </w:pPr>
+      <w:rPr>
+        <w:rFonts w:ascii="Wingdings" w:hAnsi="Wingdings" w:hint="default"/>
+        <w:sz w:val="20"/>
+      </w:rPr>
+    </w:lvl>
+    <w:lvl w:ilvl="4" w:tentative="1">
+      <w:start w:val="1"/>
+      <w:numFmt w:val="bullet"/>
+      <w:lvlText w:val=""/>
+      <w:lvlJc w:val="left"/>
+      <w:pPr>
+        <w:tabs>
+          <w:tab w:val="num" w:pos="3600"/>
+        </w:tabs>
+        <w:ind w:left="3600" w:hanging="360"/>
+      </w:pPr>
+      <w:rPr>
+        <w:rFonts w:ascii="Wingdings" w:hAnsi="Wingdings" w:hint="default"/>
+        <w:sz w:val="20"/>
+      </w:rPr>
+    </w:lvl>
+    <w:lvl w:ilvl="5" w:tentative="1">
+      <w:start w:val="1"/>
+      <w:numFmt w:val="bullet"/>
+      <w:lvlText w:val=""/>
+      <w:lvlJc w:val="left"/>
+      <w:pPr>
+        <w:tabs>
+          <w:tab w:val="num" w:pos="4320"/>
+        </w:tabs>
+        <w:ind w:left="4320" w:hanging="360"/>
+      </w:pPr>
+      <w:rPr>
+        <w:rFonts w:ascii="Wingdings" w:hAnsi="Wingdings" w:hint="default"/>
+        <w:sz w:val="20"/>
+      </w:rPr>
+    </w:lvl>
+    <w:lvl w:ilvl="6" w:tentative="1">
+      <w:start w:val="1"/>
+      <w:numFmt w:val="bullet"/>
+      <w:lvlText w:val=""/>
+      <w:lvlJc w:val="left"/>
+      <w:pPr>
+        <w:tabs>
+          <w:tab w:val="num" w:pos="5040"/>
+        </w:tabs>
+        <w:ind w:left="5040" w:hanging="360"/>
+      </w:pPr>
+      <w:rPr>
+        <w:rFonts w:ascii="Wingdings" w:hAnsi="Wingdings" w:hint="default"/>
+        <w:sz w:val="20"/>
+      </w:rPr>
+    </w:lvl>
+    <w:lvl w:ilvl="7" w:tentative="1">
+      <w:start w:val="1"/>
+      <w:numFmt w:val="bullet"/>
+      <w:lvlText w:val=""/>
+      <w:lvlJc w:val="left"/>
+      <w:pPr>
+        <w:tabs>
+          <w:tab w:val="num" w:pos="5760"/>
+        </w:tabs>
+        <w:ind w:left="5760" w:hanging="360"/>
+      </w:pPr>
+      <w:rPr>
+        <w:rFonts w:ascii="Wingdings" w:hAnsi="Wingdings" w:hint="default"/>
+        <w:sz w:val="20"/>
+      </w:rPr>
+    </w:lvl>
+    <w:lvl w:ilvl="8" w:tentative="1">
+      <w:start w:val="1"/>
+      <w:numFmt w:val="bullet"/>
+      <w:lvlText w:val=""/>
+      <w:lvlJc w:val="left"/>
+      <w:pPr>
+        <w:tabs>
+          <w:tab w:val="num" w:pos="6480"/>
+        </w:tabs>
+        <w:ind w:left="6480" w:hanging="360"/>
+      </w:pPr>
+      <w:rPr>
+        <w:rFonts w:ascii="Wingdings" w:hAnsi="Wingdings" w:hint="default"/>
+        <w:sz w:val="20"/>
+      </w:rPr>
+    </w:lvl>
+  </w:abstractNum>
+  <w:abstractNum w:abstractNumId="32" w15:restartNumberingAfterBreak="0">
     <w:nsid w:val="6DD5595A"/>
     <w:multiLevelType w:val="multilevel"/>
     <w:tmpl w:val="512C99FA"/>
@@ -13221,7 +17295,7 @@
       </w:rPr>
     </w:lvl>
   </w:abstractNum>
-  <w:abstractNum w:abstractNumId="20" w15:restartNumberingAfterBreak="0">
+  <w:abstractNum w:abstractNumId="33" w15:restartNumberingAfterBreak="0">
     <w:nsid w:val="6E422CCC"/>
     <w:multiLevelType w:val="multilevel"/>
     <w:tmpl w:val="AFF26AC0"/>
@@ -13370,7 +17444,7 @@
       </w:rPr>
     </w:lvl>
   </w:abstractNum>
-  <w:abstractNum w:abstractNumId="21" w15:restartNumberingAfterBreak="0">
+  <w:abstractNum w:abstractNumId="34" w15:restartNumberingAfterBreak="0">
     <w:nsid w:val="6F23578B"/>
     <w:multiLevelType w:val="multilevel"/>
     <w:tmpl w:val="776E4568"/>
@@ -13519,7 +17593,7 @@
       </w:rPr>
     </w:lvl>
   </w:abstractNum>
-  <w:abstractNum w:abstractNumId="22" w15:restartNumberingAfterBreak="0">
+  <w:abstractNum w:abstractNumId="35" w15:restartNumberingAfterBreak="0">
     <w:nsid w:val="7A13082A"/>
     <w:multiLevelType w:val="multilevel"/>
     <w:tmpl w:val="A2C26DBA"/>
@@ -13668,7 +17742,156 @@
       </w:rPr>
     </w:lvl>
   </w:abstractNum>
-  <w:abstractNum w:abstractNumId="23" w15:restartNumberingAfterBreak="0">
+  <w:abstractNum w:abstractNumId="36" w15:restartNumberingAfterBreak="0">
+    <w:nsid w:val="7A502A3E"/>
+    <w:multiLevelType w:val="multilevel"/>
+    <w:tmpl w:val="A7A88784"/>
+    <w:lvl w:ilvl="0">
+      <w:start w:val="1"/>
+      <w:numFmt w:val="bullet"/>
+      <w:lvlText w:val=""/>
+      <w:lvlJc w:val="left"/>
+      <w:pPr>
+        <w:tabs>
+          <w:tab w:val="num" w:pos="720"/>
+        </w:tabs>
+        <w:ind w:left="720" w:hanging="360"/>
+      </w:pPr>
+      <w:rPr>
+        <w:rFonts w:ascii="Symbol" w:hAnsi="Symbol" w:hint="default"/>
+        <w:sz w:val="20"/>
+      </w:rPr>
+    </w:lvl>
+    <w:lvl w:ilvl="1" w:tentative="1">
+      <w:start w:val="1"/>
+      <w:numFmt w:val="bullet"/>
+      <w:lvlText w:val="o"/>
+      <w:lvlJc w:val="left"/>
+      <w:pPr>
+        <w:tabs>
+          <w:tab w:val="num" w:pos="1440"/>
+        </w:tabs>
+        <w:ind w:left="1440" w:hanging="360"/>
+      </w:pPr>
+      <w:rPr>
+        <w:rFonts w:ascii="Courier New" w:hAnsi="Courier New" w:hint="default"/>
+        <w:sz w:val="20"/>
+      </w:rPr>
+    </w:lvl>
+    <w:lvl w:ilvl="2" w:tentative="1">
+      <w:start w:val="1"/>
+      <w:numFmt w:val="bullet"/>
+      <w:lvlText w:val=""/>
+      <w:lvlJc w:val="left"/>
+      <w:pPr>
+        <w:tabs>
+          <w:tab w:val="num" w:pos="2160"/>
+        </w:tabs>
+        <w:ind w:left="2160" w:hanging="360"/>
+      </w:pPr>
+      <w:rPr>
+        <w:rFonts w:ascii="Wingdings" w:hAnsi="Wingdings" w:hint="default"/>
+        <w:sz w:val="20"/>
+      </w:rPr>
+    </w:lvl>
+    <w:lvl w:ilvl="3" w:tentative="1">
+      <w:start w:val="1"/>
+      <w:numFmt w:val="bullet"/>
+      <w:lvlText w:val=""/>
+      <w:lvlJc w:val="left"/>
+      <w:pPr>
+        <w:tabs>
+          <w:tab w:val="num" w:pos="2880"/>
+        </w:tabs>
+        <w:ind w:left="2880" w:hanging="360"/>
+      </w:pPr>
+      <w:rPr>
+        <w:rFonts w:ascii="Wingdings" w:hAnsi="Wingdings" w:hint="default"/>
+        <w:sz w:val="20"/>
+      </w:rPr>
+    </w:lvl>
+    <w:lvl w:ilvl="4" w:tentative="1">
+      <w:start w:val="1"/>
+      <w:numFmt w:val="bullet"/>
+      <w:lvlText w:val=""/>
+      <w:lvlJc w:val="left"/>
+      <w:pPr>
+        <w:tabs>
+          <w:tab w:val="num" w:pos="3600"/>
+        </w:tabs>
+        <w:ind w:left="3600" w:hanging="360"/>
+      </w:pPr>
+      <w:rPr>
+        <w:rFonts w:ascii="Wingdings" w:hAnsi="Wingdings" w:hint="default"/>
+        <w:sz w:val="20"/>
+      </w:rPr>
+    </w:lvl>
+    <w:lvl w:ilvl="5" w:tentative="1">
+      <w:start w:val="1"/>
+      <w:numFmt w:val="bullet"/>
+      <w:lvlText w:val=""/>
+      <w:lvlJc w:val="left"/>
+      <w:pPr>
+        <w:tabs>
+          <w:tab w:val="num" w:pos="4320"/>
+        </w:tabs>
+        <w:ind w:left="4320" w:hanging="360"/>
+      </w:pPr>
+      <w:rPr>
+        <w:rFonts w:ascii="Wingdings" w:hAnsi="Wingdings" w:hint="default"/>
+        <w:sz w:val="20"/>
+      </w:rPr>
+    </w:lvl>
+    <w:lvl w:ilvl="6" w:tentative="1">
+      <w:start w:val="1"/>
+      <w:numFmt w:val="bullet"/>
+      <w:lvlText w:val=""/>
+      <w:lvlJc w:val="left"/>
+      <w:pPr>
+        <w:tabs>
+          <w:tab w:val="num" w:pos="5040"/>
+        </w:tabs>
+        <w:ind w:left="5040" w:hanging="360"/>
+      </w:pPr>
+      <w:rPr>
+        <w:rFonts w:ascii="Wingdings" w:hAnsi="Wingdings" w:hint="default"/>
+        <w:sz w:val="20"/>
+      </w:rPr>
+    </w:lvl>
+    <w:lvl w:ilvl="7" w:tentative="1">
+      <w:start w:val="1"/>
+      <w:numFmt w:val="bullet"/>
+      <w:lvlText w:val=""/>
+      <w:lvlJc w:val="left"/>
+      <w:pPr>
+        <w:tabs>
+          <w:tab w:val="num" w:pos="5760"/>
+        </w:tabs>
+        <w:ind w:left="5760" w:hanging="360"/>
+      </w:pPr>
+      <w:rPr>
+        <w:rFonts w:ascii="Wingdings" w:hAnsi="Wingdings" w:hint="default"/>
+        <w:sz w:val="20"/>
+      </w:rPr>
+    </w:lvl>
+    <w:lvl w:ilvl="8" w:tentative="1">
+      <w:start w:val="1"/>
+      <w:numFmt w:val="bullet"/>
+      <w:lvlText w:val=""/>
+      <w:lvlJc w:val="left"/>
+      <w:pPr>
+        <w:tabs>
+          <w:tab w:val="num" w:pos="6480"/>
+        </w:tabs>
+        <w:ind w:left="6480" w:hanging="360"/>
+      </w:pPr>
+      <w:rPr>
+        <w:rFonts w:ascii="Wingdings" w:hAnsi="Wingdings" w:hint="default"/>
+        <w:sz w:val="20"/>
+      </w:rPr>
+    </w:lvl>
+  </w:abstractNum>
+  <w:abstractNum w:abstractNumId="37" w15:restartNumberingAfterBreak="0">
     <w:nsid w:val="7C762153"/>
     <w:multiLevelType w:val="multilevel"/>
     <w:tmpl w:val="4DB231C0"/>
@@ -13817,7 +18040,156 @@
       </w:rPr>
     </w:lvl>
   </w:abstractNum>
-  <w:abstractNum w:abstractNumId="24" w15:restartNumberingAfterBreak="0">
+  <w:abstractNum w:abstractNumId="38" w15:restartNumberingAfterBreak="0">
+    <w:nsid w:val="7CCA3156"/>
+    <w:multiLevelType w:val="multilevel"/>
+    <w:tmpl w:val="FCB0A720"/>
+    <w:lvl w:ilvl="0">
+      <w:start w:val="1"/>
+      <w:numFmt w:val="bullet"/>
+      <w:lvlText w:val=""/>
+      <w:lvlJc w:val="left"/>
+      <w:pPr>
+        <w:tabs>
+          <w:tab w:val="num" w:pos="720"/>
+        </w:tabs>
+        <w:ind w:left="720" w:hanging="360"/>
+      </w:pPr>
+      <w:rPr>
+        <w:rFonts w:ascii="Symbol" w:hAnsi="Symbol" w:hint="default"/>
+        <w:sz w:val="20"/>
+      </w:rPr>
+    </w:lvl>
+    <w:lvl w:ilvl="1" w:tentative="1">
+      <w:start w:val="1"/>
+      <w:numFmt w:val="bullet"/>
+      <w:lvlText w:val="o"/>
+      <w:lvlJc w:val="left"/>
+      <w:pPr>
+        <w:tabs>
+          <w:tab w:val="num" w:pos="1440"/>
+        </w:tabs>
+        <w:ind w:left="1440" w:hanging="360"/>
+      </w:pPr>
+      <w:rPr>
+        <w:rFonts w:ascii="Courier New" w:hAnsi="Courier New" w:hint="default"/>
+        <w:sz w:val="20"/>
+      </w:rPr>
+    </w:lvl>
+    <w:lvl w:ilvl="2" w:tentative="1">
+      <w:start w:val="1"/>
+      <w:numFmt w:val="bullet"/>
+      <w:lvlText w:val=""/>
+      <w:lvlJc w:val="left"/>
+      <w:pPr>
+        <w:tabs>
+          <w:tab w:val="num" w:pos="2160"/>
+        </w:tabs>
+        <w:ind w:left="2160" w:hanging="360"/>
+      </w:pPr>
+      <w:rPr>
+        <w:rFonts w:ascii="Wingdings" w:hAnsi="Wingdings" w:hint="default"/>
+        <w:sz w:val="20"/>
+      </w:rPr>
+    </w:lvl>
+    <w:lvl w:ilvl="3" w:tentative="1">
+      <w:start w:val="1"/>
+      <w:numFmt w:val="bullet"/>
+      <w:lvlText w:val=""/>
+      <w:lvlJc w:val="left"/>
+      <w:pPr>
+        <w:tabs>
+          <w:tab w:val="num" w:pos="2880"/>
+        </w:tabs>
+        <w:ind w:left="2880" w:hanging="360"/>
+      </w:pPr>
+      <w:rPr>
+        <w:rFonts w:ascii="Wingdings" w:hAnsi="Wingdings" w:hint="default"/>
+        <w:sz w:val="20"/>
+      </w:rPr>
+    </w:lvl>
+    <w:lvl w:ilvl="4" w:tentative="1">
+      <w:start w:val="1"/>
+      <w:numFmt w:val="bullet"/>
+      <w:lvlText w:val=""/>
+      <w:lvlJc w:val="left"/>
+      <w:pPr>
+        <w:tabs>
+          <w:tab w:val="num" w:pos="3600"/>
+        </w:tabs>
+        <w:ind w:left="3600" w:hanging="360"/>
+      </w:pPr>
+      <w:rPr>
+        <w:rFonts w:ascii="Wingdings" w:hAnsi="Wingdings" w:hint="default"/>
+        <w:sz w:val="20"/>
+      </w:rPr>
+    </w:lvl>
+    <w:lvl w:ilvl="5" w:tentative="1">
+      <w:start w:val="1"/>
+      <w:numFmt w:val="bullet"/>
+      <w:lvlText w:val=""/>
+      <w:lvlJc w:val="left"/>
+      <w:pPr>
+        <w:tabs>
+          <w:tab w:val="num" w:pos="4320"/>
+        </w:tabs>
+        <w:ind w:left="4320" w:hanging="360"/>
+      </w:pPr>
+      <w:rPr>
+        <w:rFonts w:ascii="Wingdings" w:hAnsi="Wingdings" w:hint="default"/>
+        <w:sz w:val="20"/>
+      </w:rPr>
+    </w:lvl>
+    <w:lvl w:ilvl="6" w:tentative="1">
+      <w:start w:val="1"/>
+      <w:numFmt w:val="bullet"/>
+      <w:lvlText w:val=""/>
+      <w:lvlJc w:val="left"/>
+      <w:pPr>
+        <w:tabs>
+          <w:tab w:val="num" w:pos="5040"/>
+        </w:tabs>
+        <w:ind w:left="5040" w:hanging="360"/>
+      </w:pPr>
+      <w:rPr>
+        <w:rFonts w:ascii="Wingdings" w:hAnsi="Wingdings" w:hint="default"/>
+        <w:sz w:val="20"/>
+      </w:rPr>
+    </w:lvl>
+    <w:lvl w:ilvl="7" w:tentative="1">
+      <w:start w:val="1"/>
+      <w:numFmt w:val="bullet"/>
+      <w:lvlText w:val=""/>
+      <w:lvlJc w:val="left"/>
+      <w:pPr>
+        <w:tabs>
+          <w:tab w:val="num" w:pos="5760"/>
+        </w:tabs>
+        <w:ind w:left="5760" w:hanging="360"/>
+      </w:pPr>
+      <w:rPr>
+        <w:rFonts w:ascii="Wingdings" w:hAnsi="Wingdings" w:hint="default"/>
+        <w:sz w:val="20"/>
+      </w:rPr>
+    </w:lvl>
+    <w:lvl w:ilvl="8" w:tentative="1">
+      <w:start w:val="1"/>
+      <w:numFmt w:val="bullet"/>
+      <w:lvlText w:val=""/>
+      <w:lvlJc w:val="left"/>
+      <w:pPr>
+        <w:tabs>
+          <w:tab w:val="num" w:pos="6480"/>
+        </w:tabs>
+        <w:ind w:left="6480" w:hanging="360"/>
+      </w:pPr>
+      <w:rPr>
+        <w:rFonts w:ascii="Wingdings" w:hAnsi="Wingdings" w:hint="default"/>
+        <w:sz w:val="20"/>
+      </w:rPr>
+    </w:lvl>
+  </w:abstractNum>
+  <w:abstractNum w:abstractNumId="39" w15:restartNumberingAfterBreak="0">
     <w:nsid w:val="7D700F38"/>
     <w:multiLevelType w:val="multilevel"/>
     <w:tmpl w:val="1EB67CC0"/>
@@ -13970,76 +18342,121 @@
     <w:abstractNumId w:val="0"/>
   </w:num>
   <w:num w:numId="2">
+    <w:abstractNumId w:val="26"/>
+  </w:num>
+  <w:num w:numId="3">
+    <w:abstractNumId w:val="24"/>
+  </w:num>
+  <w:num w:numId="4">
+    <w:abstractNumId w:val="14"/>
+  </w:num>
+  <w:num w:numId="5">
+    <w:abstractNumId w:val="7"/>
+  </w:num>
+  <w:num w:numId="6">
+    <w:abstractNumId w:val="37"/>
+  </w:num>
+  <w:num w:numId="7">
+    <w:abstractNumId w:val="32"/>
+  </w:num>
+  <w:num w:numId="8">
+    <w:abstractNumId w:val="18"/>
+  </w:num>
+  <w:num w:numId="9">
+    <w:abstractNumId w:val="3"/>
+  </w:num>
+  <w:num w:numId="10">
+    <w:abstractNumId w:val="12"/>
+  </w:num>
+  <w:num w:numId="11">
+    <w:abstractNumId w:val="25"/>
+  </w:num>
+  <w:num w:numId="12">
+    <w:abstractNumId w:val="34"/>
+  </w:num>
+  <w:num w:numId="13">
+    <w:abstractNumId w:val="19"/>
+  </w:num>
+  <w:num w:numId="14">
+    <w:abstractNumId w:val="27"/>
+  </w:num>
+  <w:num w:numId="15">
+    <w:abstractNumId w:val="23"/>
+  </w:num>
+  <w:num w:numId="16">
+    <w:abstractNumId w:val="22"/>
+  </w:num>
+  <w:num w:numId="17">
+    <w:abstractNumId w:val="29"/>
+  </w:num>
+  <w:num w:numId="18">
+    <w:abstractNumId w:val="13"/>
+  </w:num>
+  <w:num w:numId="19">
+    <w:abstractNumId w:val="39"/>
+  </w:num>
+  <w:num w:numId="20">
+    <w:abstractNumId w:val="8"/>
+  </w:num>
+  <w:num w:numId="21">
+    <w:abstractNumId w:val="35"/>
+  </w:num>
+  <w:num w:numId="22">
+    <w:abstractNumId w:val="2"/>
+  </w:num>
+  <w:num w:numId="23">
+    <w:abstractNumId w:val="33"/>
+  </w:num>
+  <w:num w:numId="24">
     <w:abstractNumId w:val="16"/>
   </w:num>
-  <w:num w:numId="3">
-    <w:abstractNumId w:val="14"/>
+  <w:num w:numId="25">
+    <w:abstractNumId w:val="5"/>
   </w:num>
-  <w:num w:numId="4">
-    <w:abstractNumId w:val="8"/>
+  <w:num w:numId="26">
+    <w:abstractNumId w:val="20"/>
   </w:num>
-  <w:num w:numId="5">
+  <w:num w:numId="27">
+    <w:abstractNumId w:val="17"/>
+  </w:num>
+  <w:num w:numId="28">
+    <w:abstractNumId w:val="11"/>
+  </w:num>
+  <w:num w:numId="29">
+    <w:abstractNumId w:val="31"/>
+  </w:num>
+  <w:num w:numId="30">
+    <w:abstractNumId w:val="30"/>
+  </w:num>
+  <w:num w:numId="31">
+    <w:abstractNumId w:val="9"/>
+  </w:num>
+  <w:num w:numId="32">
+    <w:abstractNumId w:val="10"/>
+  </w:num>
+  <w:num w:numId="33">
+    <w:abstractNumId w:val="36"/>
+  </w:num>
+  <w:num w:numId="34">
     <w:abstractNumId w:val="4"/>
   </w:num>
-  <w:num w:numId="6">
-    <w:abstractNumId w:val="23"/>
+  <w:num w:numId="35">
+    <w:abstractNumId w:val="15"/>
   </w:num>
-  <w:num w:numId="7">
-    <w:abstractNumId w:val="19"/>
+  <w:num w:numId="36">
+    <w:abstractNumId w:val="1"/>
   </w:num>
-  <w:num w:numId="8">
-    <w:abstractNumId w:val="10"/>
+  <w:num w:numId="37">
+    <w:abstractNumId w:val="28"/>
   </w:num>
-  <w:num w:numId="9">
-    <w:abstractNumId w:val="2"/>
+  <w:num w:numId="38">
+    <w:abstractNumId w:val="21"/>
   </w:num>
-  <w:num w:numId="10">
+  <w:num w:numId="39">
     <w:abstractNumId w:val="6"/>
   </w:num>
-  <w:num w:numId="11">
-    <w:abstractNumId w:val="15"/>
-  </w:num>
-  <w:num w:numId="12">
-    <w:abstractNumId w:val="21"/>
-  </w:num>
-  <w:num w:numId="13">
-    <w:abstractNumId w:val="11"/>
-  </w:num>
-  <w:num w:numId="14">
-    <w:abstractNumId w:val="17"/>
-  </w:num>
-  <w:num w:numId="15">
-    <w:abstractNumId w:val="13"/>
-  </w:num>
-  <w:num w:numId="16">
-    <w:abstractNumId w:val="12"/>
-  </w:num>
-  <w:num w:numId="17">
-    <w:abstractNumId w:val="18"/>
-  </w:num>
-  <w:num w:numId="18">
-    <w:abstractNumId w:val="7"/>
-  </w:num>
-  <w:num w:numId="19">
-    <w:abstractNumId w:val="24"/>
-  </w:num>
-  <w:num w:numId="20">
-    <w:abstractNumId w:val="5"/>
-  </w:num>
-  <w:num w:numId="21">
-    <w:abstractNumId w:val="22"/>
-  </w:num>
-  <w:num w:numId="22">
-    <w:abstractNumId w:val="1"/>
-  </w:num>
-  <w:num w:numId="23">
-    <w:abstractNumId w:val="20"/>
-  </w:num>
-  <w:num w:numId="24">
-    <w:abstractNumId w:val="9"/>
-  </w:num>
-  <w:num w:numId="25">
-    <w:abstractNumId w:val="3"/>
+  <w:num w:numId="40">
+    <w:abstractNumId w:val="38"/>
   </w:num>
 </w:numbering>
 </file>

</xml_diff>